<commit_message>
recorte da v0.96 — duas condicoes nesse lugar, nao tres
</commit_message>
<xml_diff>
--- a/manual/Fundamento-MANUAL-v7.docx
+++ b/manual/Fundamento-MANUAL-v7.docx
@@ -70,7 +70,7 @@
           <w:sz w:val="20"/>
           <w:szCs w:val="20"/>
         </w:rPr>
-        <w:t xml:space="preserve">Níveis 1–20  ·  Faixa lendária 21–30  ·  Versão 7.8</w:t>
+        <w:t xml:space="preserve">Níveis 1–20  ·  Faixa lendária 21–30  ·  Versão 7.9</w:t>
       </w:r>
     </w:p>
     <w:p>
@@ -24430,7 +24430,7 @@
                 <w:sz w:val="19"/>
                 <w:szCs w:val="19"/>
               </w:rPr>
-              <w:t xml:space="preserve">Aplica uma: Derrubado, Lento, Cego, Agarrado, Surdo, Desarmado ou Calado (o alvo não conjura). Dura uma rodada.</w:t>
+              <w:t xml:space="preserve">Aplica uma: Derrubado, Cego, Surdo, Agarrado, Impedido, Envenenado, Lento, Desarmado ou Calado (o alvo não conjura). Dura uma rodada.</w:t>
             </w:r>
           </w:p>
         </w:tc>
@@ -24522,7 +24522,7 @@
                 <w:sz w:val="19"/>
                 <w:szCs w:val="19"/>
               </w:rPr>
-              <w:t xml:space="preserve">Aplica uma: Atordoado, Paralisado, Amedrontado, Enfeitiçado ou Incapacitado. Dura uma rodada, com Teste de Resistência no fim de cada turno do alvo. Uma por feitiço.</w:t>
+              <w:t xml:space="preserve">Aplica uma: Amedrontado, Enfeitiçado, Atordoado, Incapacitado ou Petrificado. Dura uma rodada, com Teste de Resistência no fim de cada turno do alvo. Uma por feitiço.</w:t>
             </w:r>
           </w:p>
         </w:tc>
@@ -25066,6 +25066,1263 @@
                 <w:szCs w:val="19"/>
               </w:rPr>
               <w:t xml:space="preserve">Cancela um efeito contínuo ou uma barreira de Classe igual ou menor que o seu.</w:t>
+            </w:r>
+          </w:p>
+        </w:tc>
+      </w:tr>
+    </w:tbl>
+    <w:p>
+      <w:pPr>
+        <w:pStyle w:val="Heading2"/>
+        <w:spacing w:after="160" w:before="340"/>
+      </w:pPr>
+      <w:r>
+        <w:rPr>
+          <w:rFonts w:ascii="Georgia" w:cs="Georgia" w:eastAsia="Georgia" w:hAnsi="Georgia"/>
+          <w:b/>
+          <w:bCs/>
+          <w:color w:val="741B47"/>
+          <w:sz w:val="28"/>
+          <w:szCs w:val="28"/>
+        </w:rPr>
+        <w:t xml:space="preserve">As condições, uma a uma</w:t>
+      </w:r>
+    </w:p>
+    <w:p>
+      <w:pPr>
+        <w:spacing w:after="140" w:before="0" w:line="276"/>
+      </w:pPr>
+      <w:r>
+        <w:t xml:space="preserve">As doze da lista acima nunca tiveram efeito escrito, e três novas entraram. Aqui está o que cada uma faz. </w:t>
+      </w:r>
+      <w:r>
+        <w:rPr>
+          <w:b/>
+          <w:bCs/>
+        </w:rPr>
+        <w:t xml:space="preserve">Uma condição dura uma rodada</w:t>
+      </w:r>
+      <w:r>
+        <w:t xml:space="preserve">, como as linhas de Controle já diziam.</w:t>
+      </w:r>
+    </w:p>
+    <w:tbl>
+      <w:tblPr>
+        <w:tblW w:type="dxa" w:w="9000"/>
+        <w:tblBorders>
+          <w:top w:val="single" w:color="C8C8C8" w:sz="4"/>
+          <w:left w:val="single" w:color="C8C8C8" w:sz="4"/>
+          <w:bottom w:val="single" w:color="C8C8C8" w:sz="4"/>
+          <w:right w:val="single" w:color="C8C8C8" w:sz="4"/>
+          <w:insideH w:val="single" w:color="C8C8C8" w:sz="2"/>
+          <w:insideV w:val="single" w:color="C8C8C8" w:sz="2"/>
+        </w:tblBorders>
+      </w:tblPr>
+      <w:tblGrid>
+        <w:gridCol w:w="2200"/>
+        <w:gridCol w:w="6800"/>
+      </w:tblGrid>
+      <w:tr>
+        <w:trPr>
+          <w:cantSplit/>
+          <w:tblHeader/>
+        </w:trPr>
+        <w:tc>
+          <w:tcPr>
+            <w:tcW w:type="dxa" w:w="2200"/>
+            <w:shd w:fill="4E1230" w:color="auto" w:val="clear"/>
+            <w:tcMar>
+              <w:top w:type="dxa" w:w="60"/>
+              <w:left w:type="dxa" w:w="110"/>
+              <w:bottom w:type="dxa" w:w="60"/>
+              <w:right w:type="dxa" w:w="110"/>
+            </w:tcMar>
+            <w:vAlign w:val="center"/>
+          </w:tcPr>
+          <w:p>
+            <w:pPr>
+              <w:spacing w:after="40" w:before="40" w:line="240"/>
+              <w:jc w:val="left"/>
+            </w:pPr>
+            <w:r>
+              <w:rPr>
+                <w:b/>
+                <w:bCs/>
+                <w:color w:val="FFFFFF"/>
+                <w:sz w:val="18"/>
+                <w:szCs w:val="18"/>
+              </w:rPr>
+              <w:t xml:space="preserve">Menor</w:t>
+            </w:r>
+          </w:p>
+        </w:tc>
+        <w:tc>
+          <w:tcPr>
+            <w:tcW w:type="dxa" w:w="6800"/>
+            <w:shd w:fill="4E1230" w:color="auto" w:val="clear"/>
+            <w:tcMar>
+              <w:top w:type="dxa" w:w="60"/>
+              <w:left w:type="dxa" w:w="110"/>
+              <w:bottom w:type="dxa" w:w="60"/>
+              <w:right w:type="dxa" w:w="110"/>
+            </w:tcMar>
+            <w:vAlign w:val="center"/>
+          </w:tcPr>
+          <w:p>
+            <w:pPr>
+              <w:spacing w:after="40" w:before="40" w:line="240"/>
+              <w:jc w:val="center"/>
+            </w:pPr>
+            <w:r>
+              <w:rPr>
+                <w:b/>
+                <w:bCs/>
+                <w:color w:val="FFFFFF"/>
+                <w:sz w:val="18"/>
+                <w:szCs w:val="18"/>
+              </w:rPr>
+              <w:t xml:space="preserve">O que faz</w:t>
+            </w:r>
+          </w:p>
+        </w:tc>
+      </w:tr>
+      <w:tr>
+        <w:trPr>
+          <w:cantSplit/>
+        </w:trPr>
+        <w:tc>
+          <w:tcPr>
+            <w:tcW w:type="dxa" w:w="2200"/>
+            <w:tcMar>
+              <w:top w:type="dxa" w:w="60"/>
+              <w:left w:type="dxa" w:w="110"/>
+              <w:bottom w:type="dxa" w:w="60"/>
+              <w:right w:type="dxa" w:w="110"/>
+            </w:tcMar>
+            <w:vAlign w:val="center"/>
+          </w:tcPr>
+          <w:p>
+            <w:pPr>
+              <w:spacing w:after="40" w:before="40" w:line="240"/>
+              <w:jc w:val="left"/>
+            </w:pPr>
+            <w:r>
+              <w:rPr>
+                <w:b/>
+                <w:bCs/>
+                <w:color w:val="1A1A1A"/>
+                <w:sz w:val="19"/>
+                <w:szCs w:val="19"/>
+              </w:rPr>
+              <w:t xml:space="preserve">Derrubado</w:t>
+            </w:r>
+          </w:p>
+        </w:tc>
+        <w:tc>
+          <w:tcPr>
+            <w:tcW w:type="dxa" w:w="6800"/>
+            <w:tcMar>
+              <w:top w:type="dxa" w:w="60"/>
+              <w:left w:type="dxa" w:w="110"/>
+              <w:bottom w:type="dxa" w:w="60"/>
+              <w:right w:type="dxa" w:w="110"/>
+            </w:tcMar>
+            <w:vAlign w:val="center"/>
+          </w:tcPr>
+          <w:p>
+            <w:pPr>
+              <w:spacing w:after="40" w:before="40" w:line="240"/>
+              <w:jc w:val="left"/>
+            </w:pPr>
+            <w:r>
+              <w:rPr>
+                <w:b w:val="false"/>
+                <w:bCs w:val="false"/>
+                <w:color w:val="1A1A1A"/>
+                <w:sz w:val="19"/>
+                <w:szCs w:val="19"/>
+              </w:rPr>
+              <w:t xml:space="preserve">No chão. Só se move rastejando, desvantagem nos seus ataques, e quem ataca de até 1,5 m tem vantagem — de longe, desvantagem.</w:t>
+            </w:r>
+          </w:p>
+        </w:tc>
+      </w:tr>
+      <w:tr>
+        <w:trPr>
+          <w:cantSplit/>
+        </w:trPr>
+        <w:tc>
+          <w:tcPr>
+            <w:tcW w:type="dxa" w:w="2200"/>
+            <w:shd w:fill="F7F4F6" w:color="auto" w:val="clear"/>
+            <w:tcMar>
+              <w:top w:type="dxa" w:w="60"/>
+              <w:left w:type="dxa" w:w="110"/>
+              <w:bottom w:type="dxa" w:w="60"/>
+              <w:right w:type="dxa" w:w="110"/>
+            </w:tcMar>
+            <w:vAlign w:val="center"/>
+          </w:tcPr>
+          <w:p>
+            <w:pPr>
+              <w:spacing w:after="40" w:before="40" w:line="240"/>
+              <w:jc w:val="left"/>
+            </w:pPr>
+            <w:r>
+              <w:rPr>
+                <w:b/>
+                <w:bCs/>
+                <w:color w:val="1A1A1A"/>
+                <w:sz w:val="19"/>
+                <w:szCs w:val="19"/>
+              </w:rPr>
+              <w:t xml:space="preserve">Cego</w:t>
+            </w:r>
+          </w:p>
+        </w:tc>
+        <w:tc>
+          <w:tcPr>
+            <w:tcW w:type="dxa" w:w="6800"/>
+            <w:shd w:fill="F7F4F6" w:color="auto" w:val="clear"/>
+            <w:tcMar>
+              <w:top w:type="dxa" w:w="60"/>
+              <w:left w:type="dxa" w:w="110"/>
+              <w:bottom w:type="dxa" w:w="60"/>
+              <w:right w:type="dxa" w:w="110"/>
+            </w:tcMar>
+            <w:vAlign w:val="center"/>
+          </w:tcPr>
+          <w:p>
+            <w:pPr>
+              <w:spacing w:after="40" w:before="40" w:line="240"/>
+              <w:jc w:val="left"/>
+            </w:pPr>
+            <w:r>
+              <w:rPr>
+                <w:b w:val="false"/>
+                <w:bCs w:val="false"/>
+                <w:color w:val="1A1A1A"/>
+                <w:sz w:val="19"/>
+                <w:szCs w:val="19"/>
+              </w:rPr>
+              <w:t xml:space="preserve">Não enxerga. Falha automático em teste que precise de vista, desvantagem nos seus ataques, vantagem para quem te ataca.</w:t>
+            </w:r>
+          </w:p>
+        </w:tc>
+      </w:tr>
+      <w:tr>
+        <w:trPr>
+          <w:cantSplit/>
+        </w:trPr>
+        <w:tc>
+          <w:tcPr>
+            <w:tcW w:type="dxa" w:w="2200"/>
+            <w:tcMar>
+              <w:top w:type="dxa" w:w="60"/>
+              <w:left w:type="dxa" w:w="110"/>
+              <w:bottom w:type="dxa" w:w="60"/>
+              <w:right w:type="dxa" w:w="110"/>
+            </w:tcMar>
+            <w:vAlign w:val="center"/>
+          </w:tcPr>
+          <w:p>
+            <w:pPr>
+              <w:spacing w:after="40" w:before="40" w:line="240"/>
+              <w:jc w:val="left"/>
+            </w:pPr>
+            <w:r>
+              <w:rPr>
+                <w:b/>
+                <w:bCs/>
+                <w:color w:val="1A1A1A"/>
+                <w:sz w:val="19"/>
+                <w:szCs w:val="19"/>
+              </w:rPr>
+              <w:t xml:space="preserve">Surdo</w:t>
+            </w:r>
+          </w:p>
+        </w:tc>
+        <w:tc>
+          <w:tcPr>
+            <w:tcW w:type="dxa" w:w="6800"/>
+            <w:tcMar>
+              <w:top w:type="dxa" w:w="60"/>
+              <w:left w:type="dxa" w:w="110"/>
+              <w:bottom w:type="dxa" w:w="60"/>
+              <w:right w:type="dxa" w:w="110"/>
+            </w:tcMar>
+            <w:vAlign w:val="center"/>
+          </w:tcPr>
+          <w:p>
+            <w:pPr>
+              <w:spacing w:after="40" w:before="40" w:line="240"/>
+              <w:jc w:val="left"/>
+            </w:pPr>
+            <w:r>
+              <w:rPr>
+                <w:b w:val="false"/>
+                <w:bCs w:val="false"/>
+                <w:color w:val="1A1A1A"/>
+                <w:sz w:val="19"/>
+                <w:szCs w:val="19"/>
+              </w:rPr>
+              <w:t xml:space="preserve">Não ouve. Falha automático em teste que precise de audição.</w:t>
+            </w:r>
+          </w:p>
+        </w:tc>
+      </w:tr>
+      <w:tr>
+        <w:trPr>
+          <w:cantSplit/>
+        </w:trPr>
+        <w:tc>
+          <w:tcPr>
+            <w:tcW w:type="dxa" w:w="2200"/>
+            <w:shd w:fill="F7F4F6" w:color="auto" w:val="clear"/>
+            <w:tcMar>
+              <w:top w:type="dxa" w:w="60"/>
+              <w:left w:type="dxa" w:w="110"/>
+              <w:bottom w:type="dxa" w:w="60"/>
+              <w:right w:type="dxa" w:w="110"/>
+            </w:tcMar>
+            <w:vAlign w:val="center"/>
+          </w:tcPr>
+          <w:p>
+            <w:pPr>
+              <w:spacing w:after="40" w:before="40" w:line="240"/>
+              <w:jc w:val="left"/>
+            </w:pPr>
+            <w:r>
+              <w:rPr>
+                <w:b/>
+                <w:bCs/>
+                <w:color w:val="1A1A1A"/>
+                <w:sz w:val="19"/>
+                <w:szCs w:val="19"/>
+              </w:rPr>
+              <w:t xml:space="preserve">Agarrado</w:t>
+            </w:r>
+          </w:p>
+        </w:tc>
+        <w:tc>
+          <w:tcPr>
+            <w:tcW w:type="dxa" w:w="6800"/>
+            <w:shd w:fill="F7F4F6" w:color="auto" w:val="clear"/>
+            <w:tcMar>
+              <w:top w:type="dxa" w:w="60"/>
+              <w:left w:type="dxa" w:w="110"/>
+              <w:bottom w:type="dxa" w:w="60"/>
+              <w:right w:type="dxa" w:w="110"/>
+            </w:tcMar>
+            <w:vAlign w:val="center"/>
+          </w:tcPr>
+          <w:p>
+            <w:pPr>
+              <w:spacing w:after="40" w:before="40" w:line="240"/>
+              <w:jc w:val="left"/>
+            </w:pPr>
+            <w:r>
+              <w:rPr>
+                <w:b w:val="false"/>
+                <w:bCs w:val="false"/>
+                <w:color w:val="1A1A1A"/>
+                <w:sz w:val="19"/>
+                <w:szCs w:val="19"/>
+              </w:rPr>
+              <w:t xml:space="preserve">Deslocamento 0. Acaba se quem agarrou ficar Incapacitado, ou se algo te tirar do alcance dele.</w:t>
+            </w:r>
+          </w:p>
+        </w:tc>
+      </w:tr>
+      <w:tr>
+        <w:trPr>
+          <w:cantSplit/>
+        </w:trPr>
+        <w:tc>
+          <w:tcPr>
+            <w:tcW w:type="dxa" w:w="2200"/>
+            <w:tcMar>
+              <w:top w:type="dxa" w:w="60"/>
+              <w:left w:type="dxa" w:w="110"/>
+              <w:bottom w:type="dxa" w:w="60"/>
+              <w:right w:type="dxa" w:w="110"/>
+            </w:tcMar>
+            <w:vAlign w:val="center"/>
+          </w:tcPr>
+          <w:p>
+            <w:pPr>
+              <w:spacing w:after="40" w:before="40" w:line="240"/>
+              <w:jc w:val="left"/>
+            </w:pPr>
+            <w:r>
+              <w:rPr>
+                <w:b/>
+                <w:bCs/>
+                <w:color w:val="1A1A1A"/>
+                <w:sz w:val="19"/>
+                <w:szCs w:val="19"/>
+              </w:rPr>
+              <w:t xml:space="preserve">Impedido</w:t>
+            </w:r>
+          </w:p>
+        </w:tc>
+        <w:tc>
+          <w:tcPr>
+            <w:tcW w:type="dxa" w:w="6800"/>
+            <w:tcMar>
+              <w:top w:type="dxa" w:w="60"/>
+              <w:left w:type="dxa" w:w="110"/>
+              <w:bottom w:type="dxa" w:w="60"/>
+              <w:right w:type="dxa" w:w="110"/>
+            </w:tcMar>
+            <w:vAlign w:val="center"/>
+          </w:tcPr>
+          <w:p>
+            <w:pPr>
+              <w:spacing w:after="40" w:before="40" w:line="240"/>
+              <w:jc w:val="left"/>
+            </w:pPr>
+            <w:r>
+              <w:rPr>
+                <w:b w:val="false"/>
+                <w:bCs w:val="false"/>
+                <w:color w:val="1A1A1A"/>
+                <w:sz w:val="19"/>
+                <w:szCs w:val="19"/>
+              </w:rPr>
+              <w:t xml:space="preserve">Deslocamento 0, desvantagem nos seus ataques e no Teste de Resistência Físico, e vantagem para quem te ataca.</w:t>
+            </w:r>
+          </w:p>
+        </w:tc>
+      </w:tr>
+      <w:tr>
+        <w:trPr>
+          <w:cantSplit/>
+        </w:trPr>
+        <w:tc>
+          <w:tcPr>
+            <w:tcW w:type="dxa" w:w="2200"/>
+            <w:shd w:fill="F7F4F6" w:color="auto" w:val="clear"/>
+            <w:tcMar>
+              <w:top w:type="dxa" w:w="60"/>
+              <w:left w:type="dxa" w:w="110"/>
+              <w:bottom w:type="dxa" w:w="60"/>
+              <w:right w:type="dxa" w:w="110"/>
+            </w:tcMar>
+            <w:vAlign w:val="center"/>
+          </w:tcPr>
+          <w:p>
+            <w:pPr>
+              <w:spacing w:after="40" w:before="40" w:line="240"/>
+              <w:jc w:val="left"/>
+            </w:pPr>
+            <w:r>
+              <w:rPr>
+                <w:b/>
+                <w:bCs/>
+                <w:color w:val="1A1A1A"/>
+                <w:sz w:val="19"/>
+                <w:szCs w:val="19"/>
+              </w:rPr>
+              <w:t xml:space="preserve">Envenenado</w:t>
+            </w:r>
+          </w:p>
+        </w:tc>
+        <w:tc>
+          <w:tcPr>
+            <w:tcW w:type="dxa" w:w="6800"/>
+            <w:shd w:fill="F7F4F6" w:color="auto" w:val="clear"/>
+            <w:tcMar>
+              <w:top w:type="dxa" w:w="60"/>
+              <w:left w:type="dxa" w:w="110"/>
+              <w:bottom w:type="dxa" w:w="60"/>
+              <w:right w:type="dxa" w:w="110"/>
+            </w:tcMar>
+            <w:vAlign w:val="center"/>
+          </w:tcPr>
+          <w:p>
+            <w:pPr>
+              <w:spacing w:after="40" w:before="40" w:line="240"/>
+              <w:jc w:val="left"/>
+            </w:pPr>
+            <w:r>
+              <w:rPr>
+                <w:b w:val="false"/>
+                <w:bCs w:val="false"/>
+                <w:color w:val="1A1A1A"/>
+                <w:sz w:val="19"/>
+                <w:szCs w:val="19"/>
+              </w:rPr>
+              <w:t xml:space="preserve">Desvantagem nos seus ataques e em todo teste de perícia.</w:t>
+            </w:r>
+          </w:p>
+        </w:tc>
+      </w:tr>
+      <w:tr>
+        <w:trPr>
+          <w:cantSplit/>
+        </w:trPr>
+        <w:tc>
+          <w:tcPr>
+            <w:tcW w:type="dxa" w:w="2200"/>
+            <w:tcMar>
+              <w:top w:type="dxa" w:w="60"/>
+              <w:left w:type="dxa" w:w="110"/>
+              <w:bottom w:type="dxa" w:w="60"/>
+              <w:right w:type="dxa" w:w="110"/>
+            </w:tcMar>
+            <w:vAlign w:val="center"/>
+          </w:tcPr>
+          <w:p>
+            <w:pPr>
+              <w:spacing w:after="40" w:before="40" w:line="240"/>
+              <w:jc w:val="left"/>
+            </w:pPr>
+            <w:r>
+              <w:rPr>
+                <w:b/>
+                <w:bCs/>
+                <w:color w:val="1A1A1A"/>
+                <w:sz w:val="19"/>
+                <w:szCs w:val="19"/>
+              </w:rPr>
+              <w:t xml:space="preserve">Lento</w:t>
+            </w:r>
+          </w:p>
+        </w:tc>
+        <w:tc>
+          <w:tcPr>
+            <w:tcW w:type="dxa" w:w="6800"/>
+            <w:tcMar>
+              <w:top w:type="dxa" w:w="60"/>
+              <w:left w:type="dxa" w:w="110"/>
+              <w:bottom w:type="dxa" w:w="60"/>
+              <w:right w:type="dxa" w:w="110"/>
+            </w:tcMar>
+            <w:vAlign w:val="center"/>
+          </w:tcPr>
+          <w:p>
+            <w:pPr>
+              <w:spacing w:after="40" w:before="40" w:line="240"/>
+              <w:jc w:val="left"/>
+            </w:pPr>
+            <w:r>
+              <w:rPr>
+                <w:b w:val="false"/>
+                <w:bCs w:val="false"/>
+                <w:color w:val="1A1A1A"/>
+                <w:sz w:val="19"/>
+                <w:szCs w:val="19"/>
+              </w:rPr>
+              <w:t xml:space="preserve">Deslocamento pela metade, e sem Ação Bônus.</w:t>
+            </w:r>
+          </w:p>
+        </w:tc>
+      </w:tr>
+      <w:tr>
+        <w:trPr>
+          <w:cantSplit/>
+        </w:trPr>
+        <w:tc>
+          <w:tcPr>
+            <w:tcW w:type="dxa" w:w="2200"/>
+            <w:shd w:fill="F7F4F6" w:color="auto" w:val="clear"/>
+            <w:tcMar>
+              <w:top w:type="dxa" w:w="60"/>
+              <w:left w:type="dxa" w:w="110"/>
+              <w:bottom w:type="dxa" w:w="60"/>
+              <w:right w:type="dxa" w:w="110"/>
+            </w:tcMar>
+            <w:vAlign w:val="center"/>
+          </w:tcPr>
+          <w:p>
+            <w:pPr>
+              <w:spacing w:after="40" w:before="40" w:line="240"/>
+              <w:jc w:val="left"/>
+            </w:pPr>
+            <w:r>
+              <w:rPr>
+                <w:b/>
+                <w:bCs/>
+                <w:color w:val="1A1A1A"/>
+                <w:sz w:val="19"/>
+                <w:szCs w:val="19"/>
+              </w:rPr>
+              <w:t xml:space="preserve">Desarmado</w:t>
+            </w:r>
+          </w:p>
+        </w:tc>
+        <w:tc>
+          <w:tcPr>
+            <w:tcW w:type="dxa" w:w="6800"/>
+            <w:shd w:fill="F7F4F6" w:color="auto" w:val="clear"/>
+            <w:tcMar>
+              <w:top w:type="dxa" w:w="60"/>
+              <w:left w:type="dxa" w:w="110"/>
+              <w:bottom w:type="dxa" w:w="60"/>
+              <w:right w:type="dxa" w:w="110"/>
+            </w:tcMar>
+            <w:vAlign w:val="center"/>
+          </w:tcPr>
+          <w:p>
+            <w:pPr>
+              <w:spacing w:after="40" w:before="40" w:line="240"/>
+              <w:jc w:val="left"/>
+            </w:pPr>
+            <w:r>
+              <w:rPr>
+                <w:b w:val="false"/>
+                <w:bCs w:val="false"/>
+                <w:color w:val="1A1A1A"/>
+                <w:sz w:val="19"/>
+                <w:szCs w:val="19"/>
+              </w:rPr>
+              <w:t xml:space="preserve">A sua arma está no chão ou na mão de outro. Você bate desarmado até pegar de volta.</w:t>
+            </w:r>
+          </w:p>
+        </w:tc>
+      </w:tr>
+      <w:tr>
+        <w:trPr>
+          <w:cantSplit/>
+        </w:trPr>
+        <w:tc>
+          <w:tcPr>
+            <w:tcW w:type="dxa" w:w="2200"/>
+            <w:tcMar>
+              <w:top w:type="dxa" w:w="60"/>
+              <w:left w:type="dxa" w:w="110"/>
+              <w:bottom w:type="dxa" w:w="60"/>
+              <w:right w:type="dxa" w:w="110"/>
+            </w:tcMar>
+            <w:vAlign w:val="center"/>
+          </w:tcPr>
+          <w:p>
+            <w:pPr>
+              <w:spacing w:after="40" w:before="40" w:line="240"/>
+              <w:jc w:val="left"/>
+            </w:pPr>
+            <w:r>
+              <w:rPr>
+                <w:b/>
+                <w:bCs/>
+                <w:color w:val="1A1A1A"/>
+                <w:sz w:val="19"/>
+                <w:szCs w:val="19"/>
+              </w:rPr>
+              <w:t xml:space="preserve">Calado</w:t>
+            </w:r>
+          </w:p>
+        </w:tc>
+        <w:tc>
+          <w:tcPr>
+            <w:tcW w:type="dxa" w:w="6800"/>
+            <w:tcMar>
+              <w:top w:type="dxa" w:w="60"/>
+              <w:left w:type="dxa" w:w="110"/>
+              <w:bottom w:type="dxa" w:w="60"/>
+              <w:right w:type="dxa" w:w="110"/>
+            </w:tcMar>
+            <w:vAlign w:val="center"/>
+          </w:tcPr>
+          <w:p>
+            <w:pPr>
+              <w:spacing w:after="40" w:before="40" w:line="240"/>
+              <w:jc w:val="left"/>
+            </w:pPr>
+            <w:r>
+              <w:rPr>
+                <w:b w:val="false"/>
+                <w:bCs w:val="false"/>
+                <w:color w:val="1A1A1A"/>
+                <w:sz w:val="19"/>
+                <w:szCs w:val="19"/>
+              </w:rPr>
+              <w:t xml:space="preserve">Você não conjura. Nada que precise de voz, gesto ou Selo sai.</w:t>
+            </w:r>
+          </w:p>
+        </w:tc>
+      </w:tr>
+    </w:tbl>
+    <w:tbl>
+      <w:tblPr>
+        <w:tblW w:type="dxa" w:w="9000"/>
+        <w:tblBorders>
+          <w:top w:val="single" w:color="C8C8C8" w:sz="4"/>
+          <w:left w:val="single" w:color="C8C8C8" w:sz="4"/>
+          <w:bottom w:val="single" w:color="C8C8C8" w:sz="4"/>
+          <w:right w:val="single" w:color="C8C8C8" w:sz="4"/>
+          <w:insideH w:val="single" w:color="C8C8C8" w:sz="2"/>
+          <w:insideV w:val="single" w:color="C8C8C8" w:sz="2"/>
+        </w:tblBorders>
+      </w:tblPr>
+      <w:tblGrid>
+        <w:gridCol w:w="2200"/>
+        <w:gridCol w:w="6800"/>
+      </w:tblGrid>
+      <w:tr>
+        <w:trPr>
+          <w:cantSplit/>
+          <w:tblHeader/>
+        </w:trPr>
+        <w:tc>
+          <w:tcPr>
+            <w:tcW w:type="dxa" w:w="2200"/>
+            <w:shd w:fill="4E1230" w:color="auto" w:val="clear"/>
+            <w:tcMar>
+              <w:top w:type="dxa" w:w="60"/>
+              <w:left w:type="dxa" w:w="110"/>
+              <w:bottom w:type="dxa" w:w="60"/>
+              <w:right w:type="dxa" w:w="110"/>
+            </w:tcMar>
+            <w:vAlign w:val="center"/>
+          </w:tcPr>
+          <w:p>
+            <w:pPr>
+              <w:spacing w:after="40" w:before="40" w:line="240"/>
+              <w:jc w:val="left"/>
+            </w:pPr>
+            <w:r>
+              <w:rPr>
+                <w:b/>
+                <w:bCs/>
+                <w:color w:val="FFFFFF"/>
+                <w:sz w:val="18"/>
+                <w:szCs w:val="18"/>
+              </w:rPr>
+              <w:t xml:space="preserve">Maior</w:t>
+            </w:r>
+          </w:p>
+        </w:tc>
+        <w:tc>
+          <w:tcPr>
+            <w:tcW w:type="dxa" w:w="6800"/>
+            <w:shd w:fill="4E1230" w:color="auto" w:val="clear"/>
+            <w:tcMar>
+              <w:top w:type="dxa" w:w="60"/>
+              <w:left w:type="dxa" w:w="110"/>
+              <w:bottom w:type="dxa" w:w="60"/>
+              <w:right w:type="dxa" w:w="110"/>
+            </w:tcMar>
+            <w:vAlign w:val="center"/>
+          </w:tcPr>
+          <w:p>
+            <w:pPr>
+              <w:spacing w:after="40" w:before="40" w:line="240"/>
+              <w:jc w:val="center"/>
+            </w:pPr>
+            <w:r>
+              <w:rPr>
+                <w:b/>
+                <w:bCs/>
+                <w:color w:val="FFFFFF"/>
+                <w:sz w:val="18"/>
+                <w:szCs w:val="18"/>
+              </w:rPr>
+              <w:t xml:space="preserve">O que faz</w:t>
+            </w:r>
+          </w:p>
+        </w:tc>
+      </w:tr>
+      <w:tr>
+        <w:trPr>
+          <w:cantSplit/>
+        </w:trPr>
+        <w:tc>
+          <w:tcPr>
+            <w:tcW w:type="dxa" w:w="2200"/>
+            <w:tcMar>
+              <w:top w:type="dxa" w:w="60"/>
+              <w:left w:type="dxa" w:w="110"/>
+              <w:bottom w:type="dxa" w:w="60"/>
+              <w:right w:type="dxa" w:w="110"/>
+            </w:tcMar>
+            <w:vAlign w:val="center"/>
+          </w:tcPr>
+          <w:p>
+            <w:pPr>
+              <w:spacing w:after="40" w:before="40" w:line="240"/>
+              <w:jc w:val="left"/>
+            </w:pPr>
+            <w:r>
+              <w:rPr>
+                <w:b/>
+                <w:bCs/>
+                <w:color w:val="1A1A1A"/>
+                <w:sz w:val="19"/>
+                <w:szCs w:val="19"/>
+              </w:rPr>
+              <w:t xml:space="preserve">Amedrontado</w:t>
+            </w:r>
+          </w:p>
+        </w:tc>
+        <w:tc>
+          <w:tcPr>
+            <w:tcW w:type="dxa" w:w="6800"/>
+            <w:tcMar>
+              <w:top w:type="dxa" w:w="60"/>
+              <w:left w:type="dxa" w:w="110"/>
+              <w:bottom w:type="dxa" w:w="60"/>
+              <w:right w:type="dxa" w:w="110"/>
+            </w:tcMar>
+            <w:vAlign w:val="center"/>
+          </w:tcPr>
+          <w:p>
+            <w:pPr>
+              <w:spacing w:after="40" w:before="40" w:line="240"/>
+              <w:jc w:val="left"/>
+            </w:pPr>
+            <w:r>
+              <w:rPr>
+                <w:b w:val="false"/>
+                <w:bCs w:val="false"/>
+                <w:color w:val="1A1A1A"/>
+                <w:sz w:val="19"/>
+                <w:szCs w:val="19"/>
+              </w:rPr>
+              <w:t xml:space="preserve">Desvantagem em ataque e teste enquanto enxergar a fonte do medo, e você não se aproxima dela de vontade própria.</w:t>
+            </w:r>
+          </w:p>
+        </w:tc>
+      </w:tr>
+      <w:tr>
+        <w:trPr>
+          <w:cantSplit/>
+        </w:trPr>
+        <w:tc>
+          <w:tcPr>
+            <w:tcW w:type="dxa" w:w="2200"/>
+            <w:shd w:fill="F7F4F6" w:color="auto" w:val="clear"/>
+            <w:tcMar>
+              <w:top w:type="dxa" w:w="60"/>
+              <w:left w:type="dxa" w:w="110"/>
+              <w:bottom w:type="dxa" w:w="60"/>
+              <w:right w:type="dxa" w:w="110"/>
+            </w:tcMar>
+            <w:vAlign w:val="center"/>
+          </w:tcPr>
+          <w:p>
+            <w:pPr>
+              <w:spacing w:after="40" w:before="40" w:line="240"/>
+              <w:jc w:val="left"/>
+            </w:pPr>
+            <w:r>
+              <w:rPr>
+                <w:b/>
+                <w:bCs/>
+                <w:color w:val="1A1A1A"/>
+                <w:sz w:val="19"/>
+                <w:szCs w:val="19"/>
+              </w:rPr>
+              <w:t xml:space="preserve">Enfeitiçado</w:t>
+            </w:r>
+          </w:p>
+        </w:tc>
+        <w:tc>
+          <w:tcPr>
+            <w:tcW w:type="dxa" w:w="6800"/>
+            <w:shd w:fill="F7F4F6" w:color="auto" w:val="clear"/>
+            <w:tcMar>
+              <w:top w:type="dxa" w:w="60"/>
+              <w:left w:type="dxa" w:w="110"/>
+              <w:bottom w:type="dxa" w:w="60"/>
+              <w:right w:type="dxa" w:w="110"/>
+            </w:tcMar>
+            <w:vAlign w:val="center"/>
+          </w:tcPr>
+          <w:p>
+            <w:pPr>
+              <w:spacing w:after="40" w:before="40" w:line="240"/>
+              <w:jc w:val="left"/>
+            </w:pPr>
+            <w:r>
+              <w:rPr>
+                <w:b w:val="false"/>
+                <w:bCs w:val="false"/>
+                <w:color w:val="1A1A1A"/>
+                <w:sz w:val="19"/>
+                <w:szCs w:val="19"/>
+              </w:rPr>
+              <w:t xml:space="preserve">Você não ataca quem enfeitiçou nem mira efeito nocivo nele, e ele tem vantagem em teste social contra você.</w:t>
+            </w:r>
+          </w:p>
+        </w:tc>
+      </w:tr>
+      <w:tr>
+        <w:trPr>
+          <w:cantSplit/>
+        </w:trPr>
+        <w:tc>
+          <w:tcPr>
+            <w:tcW w:type="dxa" w:w="2200"/>
+            <w:tcMar>
+              <w:top w:type="dxa" w:w="60"/>
+              <w:left w:type="dxa" w:w="110"/>
+              <w:bottom w:type="dxa" w:w="60"/>
+              <w:right w:type="dxa" w:w="110"/>
+            </w:tcMar>
+            <w:vAlign w:val="center"/>
+          </w:tcPr>
+          <w:p>
+            <w:pPr>
+              <w:spacing w:after="40" w:before="40" w:line="240"/>
+              <w:jc w:val="left"/>
+            </w:pPr>
+            <w:r>
+              <w:rPr>
+                <w:b/>
+                <w:bCs/>
+                <w:color w:val="1A1A1A"/>
+                <w:sz w:val="19"/>
+                <w:szCs w:val="19"/>
+              </w:rPr>
+              <w:t xml:space="preserve">Atordoado</w:t>
+            </w:r>
+          </w:p>
+        </w:tc>
+        <w:tc>
+          <w:tcPr>
+            <w:tcW w:type="dxa" w:w="6800"/>
+            <w:tcMar>
+              <w:top w:type="dxa" w:w="60"/>
+              <w:left w:type="dxa" w:w="110"/>
+              <w:bottom w:type="dxa" w:w="60"/>
+              <w:right w:type="dxa" w:w="110"/>
+            </w:tcMar>
+            <w:vAlign w:val="center"/>
+          </w:tcPr>
+          <w:p>
+            <w:pPr>
+              <w:spacing w:after="40" w:before="40" w:line="240"/>
+              <w:jc w:val="left"/>
+            </w:pPr>
+            <w:r>
+              <w:rPr>
+                <w:b w:val="false"/>
+                <w:bCs w:val="false"/>
+                <w:color w:val="1A1A1A"/>
+                <w:sz w:val="19"/>
+                <w:szCs w:val="19"/>
+              </w:rPr>
+              <w:t xml:space="preserve">Você perde a Ação Padrão e não usa reação. Quem tem mais de uma Ação Padrão no turno perde UMA, não todas.</w:t>
+            </w:r>
+          </w:p>
+        </w:tc>
+      </w:tr>
+      <w:tr>
+        <w:trPr>
+          <w:cantSplit/>
+        </w:trPr>
+        <w:tc>
+          <w:tcPr>
+            <w:tcW w:type="dxa" w:w="2200"/>
+            <w:shd w:fill="F7F4F6" w:color="auto" w:val="clear"/>
+            <w:tcMar>
+              <w:top w:type="dxa" w:w="60"/>
+              <w:left w:type="dxa" w:w="110"/>
+              <w:bottom w:type="dxa" w:w="60"/>
+              <w:right w:type="dxa" w:w="110"/>
+            </w:tcMar>
+            <w:vAlign w:val="center"/>
+          </w:tcPr>
+          <w:p>
+            <w:pPr>
+              <w:spacing w:after="40" w:before="40" w:line="240"/>
+              <w:jc w:val="left"/>
+            </w:pPr>
+            <w:r>
+              <w:rPr>
+                <w:b/>
+                <w:bCs/>
+                <w:color w:val="1A1A1A"/>
+                <w:sz w:val="19"/>
+                <w:szCs w:val="19"/>
+              </w:rPr>
+              <w:t xml:space="preserve">Incapacitado</w:t>
+            </w:r>
+          </w:p>
+        </w:tc>
+        <w:tc>
+          <w:tcPr>
+            <w:tcW w:type="dxa" w:w="6800"/>
+            <w:shd w:fill="F7F4F6" w:color="auto" w:val="clear"/>
+            <w:tcMar>
+              <w:top w:type="dxa" w:w="60"/>
+              <w:left w:type="dxa" w:w="110"/>
+              <w:bottom w:type="dxa" w:w="60"/>
+              <w:right w:type="dxa" w:w="110"/>
+            </w:tcMar>
+            <w:vAlign w:val="center"/>
+          </w:tcPr>
+          <w:p>
+            <w:pPr>
+              <w:spacing w:after="40" w:before="40" w:line="240"/>
+              <w:jc w:val="left"/>
+            </w:pPr>
+            <w:r>
+              <w:rPr>
+                <w:b w:val="false"/>
+                <w:bCs w:val="false"/>
+                <w:color w:val="1A1A1A"/>
+                <w:sz w:val="19"/>
+                <w:szCs w:val="19"/>
+              </w:rPr>
+              <w:t xml:space="preserve">Você não pode Bloquear, e todo ataque corpo a corpo contra você é crítico.</w:t>
+            </w:r>
+          </w:p>
+        </w:tc>
+      </w:tr>
+      <w:tr>
+        <w:trPr>
+          <w:cantSplit/>
+        </w:trPr>
+        <w:tc>
+          <w:tcPr>
+            <w:tcW w:type="dxa" w:w="2200"/>
+            <w:tcMar>
+              <w:top w:type="dxa" w:w="60"/>
+              <w:left w:type="dxa" w:w="110"/>
+              <w:bottom w:type="dxa" w:w="60"/>
+              <w:right w:type="dxa" w:w="110"/>
+            </w:tcMar>
+            <w:vAlign w:val="center"/>
+          </w:tcPr>
+          <w:p>
+            <w:pPr>
+              <w:spacing w:after="40" w:before="40" w:line="240"/>
+              <w:jc w:val="left"/>
+            </w:pPr>
+            <w:r>
+              <w:rPr>
+                <w:b/>
+                <w:bCs/>
+                <w:color w:val="1A1A1A"/>
+                <w:sz w:val="19"/>
+                <w:szCs w:val="19"/>
+              </w:rPr>
+              <w:t xml:space="preserve">Petrificado</w:t>
+            </w:r>
+          </w:p>
+        </w:tc>
+        <w:tc>
+          <w:tcPr>
+            <w:tcW w:type="dxa" w:w="6800"/>
+            <w:tcMar>
+              <w:top w:type="dxa" w:w="60"/>
+              <w:left w:type="dxa" w:w="110"/>
+              <w:bottom w:type="dxa" w:w="60"/>
+              <w:right w:type="dxa" w:w="110"/>
+            </w:tcMar>
+            <w:vAlign w:val="center"/>
+          </w:tcPr>
+          <w:p>
+            <w:pPr>
+              <w:spacing w:after="40" w:before="40" w:line="240"/>
+              <w:jc w:val="left"/>
+            </w:pPr>
+            <w:r>
+              <w:rPr>
+                <w:b w:val="false"/>
+                <w:bCs w:val="false"/>
+                <w:color w:val="1A1A1A"/>
+                <w:sz w:val="19"/>
+                <w:szCs w:val="19"/>
+              </w:rPr>
+              <w:t xml:space="preserve">Virou pedra. Incapacitado, deslocamento 0, sem perceber o que está em volta, vantagem para quem te ataca — e resistência a todo dano.</w:t>
+            </w:r>
+          </w:p>
+        </w:tc>
+      </w:tr>
+    </w:tbl>
+    <w:tbl>
+      <w:tblPr>
+        <w:tblW w:type="dxa" w:w="9000"/>
+        <w:tblBorders>
+          <w:top w:val="nil"/>
+          <w:left w:val="nil"/>
+          <w:bottom w:val="nil"/>
+          <w:right w:val="nil"/>
+          <w:insideH w:val="nil"/>
+          <w:insideV w:val="nil"/>
+        </w:tblBorders>
+      </w:tblPr>
+      <w:tblGrid>
+        <w:gridCol w:w="9000"/>
+      </w:tblGrid>
+      <w:tr>
+        <w:trPr>
+          <w:cantSplit/>
+        </w:trPr>
+        <w:tc>
+          <w:tcPr>
+            <w:tcW w:type="dxa" w:w="9000"/>
+            <w:tcBorders>
+              <w:top w:val="nil"/>
+              <w:left w:val="single" w:color="4E1230" w:sz="18"/>
+              <w:bottom w:val="nil"/>
+              <w:right w:val="nil"/>
+            </w:tcBorders>
+            <w:shd w:fill="F4F1EC" w:color="auto" w:val="clear"/>
+            <w:tcMar>
+              <w:top w:type="dxa" w:w="160"/>
+              <w:left w:type="dxa" w:w="220"/>
+              <w:bottom w:type="dxa" w:w="160"/>
+              <w:right w:type="dxa" w:w="220"/>
+            </w:tcMar>
+          </w:tcPr>
+          <w:p>
+            <w:pPr>
+              <w:spacing w:after="100" w:before="20"/>
+            </w:pPr>
+            <w:r>
+              <w:rPr>
+                <w:rFonts w:ascii="Georgia" w:cs="Georgia" w:eastAsia="Georgia" w:hAnsi="Georgia"/>
+                <w:b/>
+                <w:bCs/>
+                <w:color w:val="4E1230"/>
+                <w:sz w:val="18"/>
+                <w:szCs w:val="18"/>
+              </w:rPr>
+              <w:t xml:space="preserve">ATORDOADO E INCAPACITADO ATACAM EIXOS DIFERENTES, E NÃO SE EMPILHAM</w:t>
+            </w:r>
+          </w:p>
+          <w:p>
+            <w:pPr>
+              <w:spacing w:after="110" w:line="268"/>
+            </w:pPr>
+            <w:r>
+              <w:rPr>
+                <w:sz w:val="20"/>
+                <w:szCs w:val="20"/>
+              </w:rPr>
+              <w:t xml:space="preserve">Atordoado tira PARTE do turno: uma Ação Padrão e a reação. Você continua se defendendo.</w:t>
+            </w:r>
+          </w:p>
+          <w:p>
+            <w:pPr>
+              <w:spacing w:after="110" w:line="268"/>
+            </w:pPr>
+            <w:r>
+              <w:rPr>
+                <w:sz w:val="20"/>
+                <w:szCs w:val="20"/>
+              </w:rPr>
+              <w:t xml:space="preserve">Incapacitado não tira turno nenhum — tira a DEFESA. Você age e não se protege.</w:t>
+            </w:r>
+          </w:p>
+          <w:p>
+            <w:pPr>
+              <w:spacing w:after="110" w:line="268"/>
+            </w:pPr>
+            <w:r>
+              <w:rPr>
+                <w:sz w:val="20"/>
+                <w:szCs w:val="20"/>
+              </w:rPr>
+              <w:t xml:space="preserve">Uma Condição Maior custa Pesada e você escolhe o eixo: tirar o que ele faz, ou tirar o que protege ele.</w:t>
+            </w:r>
+          </w:p>
+          <w:p>
+            <w:pPr>
+              <w:spacing w:after="20" w:line="268"/>
+            </w:pPr>
+            <w:r>
+              <w:rPr>
+                <w:sz w:val="20"/>
+                <w:szCs w:val="20"/>
+              </w:rPr>
+              <w:t xml:space="preserve">O Atordoado cobra uma Ação Padrão só de propósito: um chefe age mais de uma vez por rodada, e apagar o turno dele com uma linha de Controle sairia barato demais.</w:t>
+            </w:r>
+          </w:p>
+        </w:tc>
+      </w:tr>
+    </w:tbl>
+    <w:tbl>
+      <w:tblPr>
+        <w:tblW w:type="dxa" w:w="9000"/>
+        <w:tblBorders>
+          <w:top w:val="nil"/>
+          <w:left w:val="nil"/>
+          <w:bottom w:val="nil"/>
+          <w:right w:val="nil"/>
+          <w:insideH w:val="nil"/>
+          <w:insideV w:val="nil"/>
+        </w:tblBorders>
+      </w:tblPr>
+      <w:tblGrid>
+        <w:gridCol w:w="9000"/>
+      </w:tblGrid>
+      <w:tr>
+        <w:trPr>
+          <w:cantSplit/>
+        </w:trPr>
+        <w:tc>
+          <w:tcPr>
+            <w:tcW w:type="dxa" w:w="9000"/>
+            <w:tcBorders>
+              <w:top w:val="nil"/>
+              <w:left w:val="single" w:color="741B47" w:sz="18"/>
+              <w:bottom w:val="nil"/>
+              <w:right w:val="nil"/>
+            </w:tcBorders>
+            <w:shd w:fill="F7E9F1" w:color="auto" w:val="clear"/>
+            <w:tcMar>
+              <w:top w:type="dxa" w:w="160"/>
+              <w:left w:type="dxa" w:w="220"/>
+              <w:bottom w:type="dxa" w:w="160"/>
+              <w:right w:type="dxa" w:w="220"/>
+            </w:tcMar>
+          </w:tcPr>
+          <w:p>
+            <w:pPr>
+              <w:spacing w:after="100" w:before="20"/>
+            </w:pPr>
+            <w:r>
+              <w:rPr>
+                <w:rFonts w:ascii="Georgia" w:cs="Georgia" w:eastAsia="Georgia" w:hAnsi="Georgia"/>
+                <w:b/>
+                <w:bCs/>
+                <w:color w:val="741B47"/>
+                <w:sz w:val="18"/>
+                <w:szCs w:val="18"/>
+              </w:rPr>
+              <w:t xml:space="preserve">TRÊS COISAS QUE NÃO SÃO CONDIÇÃO AQUI</w:t>
+            </w:r>
+          </w:p>
+          <w:p>
+            <w:pPr>
+              <w:spacing w:after="110" w:line="268"/>
+            </w:pPr>
+            <w:r>
+              <w:rPr>
+                <w:sz w:val="20"/>
+                <w:szCs w:val="20"/>
+              </w:rPr>
+              <w:t xml:space="preserve">Inconsciente é cair morrendo, e tem regra própria no sistema em volta — não é efeito de uma rodada.</w:t>
+            </w:r>
+          </w:p>
+          <w:p>
+            <w:pPr>
+              <w:spacing w:after="110" w:line="268"/>
+            </w:pPr>
+            <w:r>
+              <w:rPr>
+                <w:sz w:val="20"/>
+                <w:szCs w:val="20"/>
+              </w:rPr>
+              <w:t xml:space="preserve">Exaustão é relógio de descanso, e Condição Menor não alcança ela.</w:t>
+            </w:r>
+          </w:p>
+          <w:p>
+            <w:pPr>
+              <w:spacing w:after="20" w:line="268"/>
+            </w:pPr>
+            <w:r>
+              <w:rPr>
+                <w:sz w:val="20"/>
+                <w:szCs w:val="20"/>
+              </w:rPr>
+              <w:t xml:space="preserve">Invisível é benefício: comprar para aplicar num inimigo é pagar para ajudar ele.</w:t>
             </w:r>
           </w:p>
         </w:tc>
@@ -40744,7 +42001,7 @@
                 <w:sz w:val="19"/>
                 <w:szCs w:val="19"/>
               </w:rPr>
-              <w:t xml:space="preserve">Explosão (−2) · Paralisado (−5) · Terreno (−2)</w:t>
+              <w:t xml:space="preserve">Explosão (−2) · Atordoado (−5) · Terreno (−2)</w:t>
             </w:r>
           </w:p>
         </w:tc>
@@ -40772,7 +42029,7 @@
                 <w:sz w:val="19"/>
                 <w:szCs w:val="19"/>
               </w:rPr>
-              <w:t xml:space="preserve">zero dano: Paralisado + terreno difícil, CD +2, tudo durando uma rodada a mais</w:t>
+              <w:t xml:space="preserve">zero dano: Atordoado + terreno difícil, CD +2, tudo durando uma rodada a mais</w:t>
             </w:r>
           </w:p>
         </w:tc>
@@ -41142,7 +42399,7 @@
                 <w:sz w:val="19"/>
                 <w:szCs w:val="19"/>
               </w:rPr>
-              <w:t xml:space="preserve">Explosão (−2) · Paralisado (−6) · Escolher (−4) · Sangra (+4)</w:t>
+              <w:t xml:space="preserve">Explosão (−2) · Atordoado (−6) · Escolher (−4) · Sangra (+4)</w:t>
             </w:r>
           </w:p>
         </w:tc>
@@ -41170,7 +42427,7 @@
                 <w:sz w:val="19"/>
                 <w:szCs w:val="19"/>
               </w:rPr>
-              <w:t xml:space="preserve">4d8 = 18 + Paralisado durando uma rodada a mais; você toma 8</w:t>
+              <w:t xml:space="preserve">4d8 = 18 + Atordoado durando uma rodada a mais; você toma 8</w:t>
             </w:r>
           </w:p>
         </w:tc>

</xml_diff>

<commit_message>
recorte da v0.104 — a Melhoria Condição, as cinco vagas de Desliga e a penalidade de arma
</commit_message>
<xml_diff>
--- a/manual/Fundamento-MANUAL-v7.docx
+++ b/manual/Fundamento-MANUAL-v7.docx
@@ -70,7 +70,7 @@
           <w:sz w:val="20"/>
           <w:szCs w:val="20"/>
         </w:rPr>
-        <w:t xml:space="preserve">Níveis 1–20  ·  Faixa lendária 21–30  ·  Versão 7.9</w:t>
+        <w:t xml:space="preserve">Níveis 1–20  ·  Faixa lendária 21–30  ·  Versão 7.10</w:t>
       </w:r>
     </w:p>
     <w:p>
@@ -19421,7 +19421,7 @@
                 <w:sz w:val="18"/>
                 <w:szCs w:val="18"/>
               </w:rPr>
-              <w:t xml:space="preserve">Derrubado (Média)</w:t>
+              <w:t xml:space="preserve">Derrubado (Leve)</w:t>
             </w:r>
           </w:p>
         </w:tc>
@@ -19625,7 +19625,7 @@
                 <w:sz w:val="19"/>
                 <w:szCs w:val="19"/>
               </w:rPr>
-              <w:t xml:space="preserve">−2</w:t>
+              <w:t xml:space="preserve">−1</w:t>
             </w:r>
           </w:p>
         </w:tc>
@@ -19681,7 +19681,7 @@
                 <w:sz w:val="19"/>
                 <w:szCs w:val="19"/>
               </w:rPr>
-              <w:t xml:space="preserve">5d8 = 22</w:t>
+              <w:t xml:space="preserve">6d8 = 27</w:t>
             </w:r>
           </w:p>
         </w:tc>
@@ -19830,7 +19830,7 @@
                 <w:sz w:val="19"/>
                 <w:szCs w:val="19"/>
               </w:rPr>
-              <w:t xml:space="preserve">−3</w:t>
+              <w:t xml:space="preserve">−2</w:t>
             </w:r>
           </w:p>
         </w:tc>
@@ -19888,7 +19888,7 @@
                 <w:sz w:val="19"/>
                 <w:szCs w:val="19"/>
               </w:rPr>
-              <w:t xml:space="preserve">7d8 = 31</w:t>
+              <w:t xml:space="preserve">8d8 = 36</w:t>
             </w:r>
           </w:p>
         </w:tc>
@@ -20034,7 +20034,7 @@
                 <w:sz w:val="19"/>
                 <w:szCs w:val="19"/>
               </w:rPr>
-              <w:t xml:space="preserve">−5</w:t>
+              <w:t xml:space="preserve">−3</w:t>
             </w:r>
           </w:p>
         </w:tc>
@@ -20090,7 +20090,7 @@
                 <w:sz w:val="19"/>
                 <w:szCs w:val="19"/>
               </w:rPr>
-              <w:t xml:space="preserve">12d8 = 54</w:t>
+              <w:t xml:space="preserve">14d8 = 63</w:t>
             </w:r>
           </w:p>
         </w:tc>
@@ -20134,7 +20134,7 @@
         <w:spacing w:after="140" w:before="0" w:line="276"/>
       </w:pPr>
       <w:r>
-        <w:t xml:space="preserve">O dano sobe, a proporção não: em todas as Classes a Palma sai perto de 60% do teto, bem acima do quarto que o bônus de Controle exige. Ampliar aumenta o número, não muda a natureza do feitiço — quem não alcançava o bônus continua sem alcançar (a regra de Controle está no fim desta seção).</w:t>
+        <w:t xml:space="preserve">O dano sobe, a proporção não: em todas as Classes a Palma sai perto de 70% do teto, bem acima do quarto que o bônus de Controle exige. Ampliar aumenta o número, não muda a natureza do feitiço — quem não alcançava o bônus continua sem alcançar (a regra de Controle está no fim desta seção).</w:t>
       </w:r>
     </w:p>
     <w:p>
@@ -21235,7 +21235,7 @@
                 <w:sz w:val="19"/>
                 <w:szCs w:val="19"/>
               </w:rPr>
-              <w:t xml:space="preserve">Condição Menor (−5)</w:t>
+              <w:t xml:space="preserve">Condição Leve (−3)</w:t>
             </w:r>
           </w:p>
         </w:tc>
@@ -21264,7 +21264,7 @@
                 <w:sz w:val="19"/>
                 <w:szCs w:val="19"/>
               </w:rPr>
-              <w:t xml:space="preserve">10d8</w:t>
+              <w:t xml:space="preserve">12d8</w:t>
             </w:r>
           </w:p>
         </w:tc>
@@ -21326,7 +21326,7 @@
                 <w:sz w:val="19"/>
                 <w:szCs w:val="19"/>
               </w:rPr>
-              <w:t xml:space="preserve">Condição Maior (−8)</w:t>
+              <w:t xml:space="preserve">Condição Média (−5)</w:t>
             </w:r>
           </w:p>
         </w:tc>
@@ -21354,7 +21354,7 @@
                 <w:sz w:val="19"/>
                 <w:szCs w:val="19"/>
               </w:rPr>
-              <w:t xml:space="preserve">7d8</w:t>
+              <w:t xml:space="preserve">10d8</w:t>
             </w:r>
           </w:p>
         </w:tc>
@@ -21416,7 +21416,7 @@
                 <w:sz w:val="19"/>
                 <w:szCs w:val="19"/>
               </w:rPr>
-              <w:t xml:space="preserve">Condição Maior (−8) · Condição Menor (−5)</w:t>
+              <w:t xml:space="preserve">Condição Pesada (−8)</w:t>
             </w:r>
           </w:p>
         </w:tc>
@@ -21445,7 +21445,7 @@
                 <w:sz w:val="19"/>
                 <w:szCs w:val="19"/>
               </w:rPr>
-              <w:t xml:space="preserve">2d8</w:t>
+              <w:t xml:space="preserve">7d8</w:t>
             </w:r>
           </w:p>
         </w:tc>
@@ -21474,7 +21474,7 @@
                 <w:sz w:val="19"/>
                 <w:szCs w:val="19"/>
               </w:rPr>
-              <w:t xml:space="preserve">dura uma rodada a mais</w:t>
+              <w:t xml:space="preserve">nada</w:t>
             </w:r>
           </w:p>
         </w:tc>
@@ -21507,7 +21507,7 @@
                 <w:sz w:val="19"/>
                 <w:szCs w:val="19"/>
               </w:rPr>
-              <w:t xml:space="preserve">Explosão (−3) · Cond. Menor (−5) · Prende (−5) · Puxa (−5) · Lento (+3)</w:t>
+              <w:t xml:space="preserve">Condição Pesada (−8) · Condição Média (−5)</w:t>
             </w:r>
           </w:p>
         </w:tc>
@@ -21535,6 +21535,97 @@
                 <w:sz w:val="19"/>
                 <w:szCs w:val="19"/>
               </w:rPr>
+              <w:t xml:space="preserve">2d8</w:t>
+            </w:r>
+          </w:p>
+        </w:tc>
+        <w:tc>
+          <w:tcPr>
+            <w:tcW w:type="dxa" w:w="3420"/>
+            <w:tcMar>
+              <w:top w:type="dxa" w:w="60"/>
+              <w:left w:type="dxa" w:w="110"/>
+              <w:bottom w:type="dxa" w:w="60"/>
+              <w:right w:type="dxa" w:w="110"/>
+            </w:tcMar>
+            <w:vAlign w:val="center"/>
+          </w:tcPr>
+          <w:p>
+            <w:pPr>
+              <w:spacing w:after="40" w:before="40" w:line="240"/>
+              <w:jc w:val="left"/>
+            </w:pPr>
+            <w:r>
+              <w:rPr>
+                <w:b w:val="false"/>
+                <w:bCs w:val="false"/>
+                <w:color w:val="1A1A1A"/>
+                <w:sz w:val="19"/>
+                <w:szCs w:val="19"/>
+              </w:rPr>
+              <w:t xml:space="preserve">dura uma rodada a mais</w:t>
+            </w:r>
+          </w:p>
+        </w:tc>
+      </w:tr>
+      <w:tr>
+        <w:trPr>
+          <w:cantSplit/>
+        </w:trPr>
+        <w:tc>
+          <w:tcPr>
+            <w:tcW w:type="dxa" w:w="4320"/>
+            <w:shd w:fill="F7F4F6" w:color="auto" w:val="clear"/>
+            <w:tcMar>
+              <w:top w:type="dxa" w:w="60"/>
+              <w:left w:type="dxa" w:w="110"/>
+              <w:bottom w:type="dxa" w:w="60"/>
+              <w:right w:type="dxa" w:w="110"/>
+            </w:tcMar>
+            <w:vAlign w:val="center"/>
+          </w:tcPr>
+          <w:p>
+            <w:pPr>
+              <w:spacing w:after="40" w:before="40" w:line="240"/>
+              <w:jc w:val="left"/>
+            </w:pPr>
+            <w:r>
+              <w:rPr>
+                <w:b/>
+                <w:bCs/>
+                <w:color w:val="1A1A1A"/>
+                <w:sz w:val="19"/>
+                <w:szCs w:val="19"/>
+              </w:rPr>
+              <w:t xml:space="preserve">Explosão (−3) · Cond. Média (−5) · Prende (−5) · Puxa (−5) · Parado (+3)</w:t>
+            </w:r>
+          </w:p>
+        </w:tc>
+        <w:tc>
+          <w:tcPr>
+            <w:tcW w:type="dxa" w:w="1260"/>
+            <w:shd w:fill="F7F4F6" w:color="auto" w:val="clear"/>
+            <w:tcMar>
+              <w:top w:type="dxa" w:w="60"/>
+              <w:left w:type="dxa" w:w="110"/>
+              <w:bottom w:type="dxa" w:w="60"/>
+              <w:right w:type="dxa" w:w="110"/>
+            </w:tcMar>
+            <w:vAlign w:val="center"/>
+          </w:tcPr>
+          <w:p>
+            <w:pPr>
+              <w:spacing w:after="40" w:before="40" w:line="240"/>
+              <w:jc w:val="center"/>
+            </w:pPr>
+            <w:r>
+              <w:rPr>
+                <w:b w:val="false"/>
+                <w:bCs w:val="false"/>
+                <w:color w:val="1A1A1A"/>
+                <w:sz w:val="19"/>
+                <w:szCs w:val="19"/>
+              </w:rPr>
               <w:t xml:space="preserve">0d8</w:t>
             </w:r>
           </w:p>
@@ -21542,6 +21633,7 @@
         <w:tc>
           <w:tcPr>
             <w:tcW w:type="dxa" w:w="3420"/>
+            <w:shd w:fill="F7F4F6" w:color="auto" w:val="clear"/>
             <w:tcMar>
               <w:top w:type="dxa" w:w="60"/>
               <w:left w:type="dxa" w:w="110"/>
@@ -24374,7 +24466,7 @@
                 <w:sz w:val="19"/>
                 <w:szCs w:val="19"/>
               </w:rPr>
-              <w:t xml:space="preserve">Condição Menor</w:t>
+              <w:t xml:space="preserve">Condição</w:t>
             </w:r>
           </w:p>
         </w:tc>
@@ -24402,7 +24494,7 @@
                 <w:sz w:val="19"/>
                 <w:szCs w:val="19"/>
               </w:rPr>
-              <w:t xml:space="preserve">Média</w:t>
+              <w:t xml:space="preserve">o nível dela</w:t>
             </w:r>
           </w:p>
         </w:tc>
@@ -24430,7 +24522,7 @@
                 <w:sz w:val="19"/>
                 <w:szCs w:val="19"/>
               </w:rPr>
-              <w:t xml:space="preserve">Aplica uma: Derrubado, Cego, Surdo, Agarrado, Impedido, Envenenado, Lento, Desarmado ou Calado (o alvo não conjura). Dura uma rodada.</w:t>
+              <w:t xml:space="preserve">Aplica uma das catorze condições. O preço é o nível dela — Leve, Média ou Pesada —, na tabela logo abaixo. Dura uma rodada. As de nível Pesada dão Teste de Resistência no fim de cada turno do alvo, e cabe só uma delas por feitiço.</w:t>
             </w:r>
           </w:p>
         </w:tc>
@@ -24464,7 +24556,7 @@
                 <w:sz w:val="19"/>
                 <w:szCs w:val="19"/>
               </w:rPr>
-              <w:t xml:space="preserve">Condição Maior</w:t>
+              <w:t xml:space="preserve">Terreno</w:t>
             </w:r>
           </w:p>
         </w:tc>
@@ -24493,7 +24585,7 @@
                 <w:sz w:val="19"/>
                 <w:szCs w:val="19"/>
               </w:rPr>
-              <w:t xml:space="preserve">Pesada</w:t>
+              <w:t xml:space="preserve">Leve</w:t>
             </w:r>
           </w:p>
         </w:tc>
@@ -24522,7 +24614,7 @@
                 <w:sz w:val="19"/>
                 <w:szCs w:val="19"/>
               </w:rPr>
-              <w:t xml:space="preserve">Aplica uma: Amedrontado, Enfeitiçado, Atordoado, Incapacitado ou Petrificado. Dura uma rodada, com Teste de Resistência no fim de cada turno do alvo. Uma por feitiço.</w:t>
+              <w:t xml:space="preserve">A área vira terreno difícil, ou fica obscurecida, por uma rodada.</w:t>
             </w:r>
           </w:p>
         </w:tc>
@@ -24555,7 +24647,7 @@
                 <w:sz w:val="19"/>
                 <w:szCs w:val="19"/>
               </w:rPr>
-              <w:t xml:space="preserve">Terreno</w:t>
+              <w:t xml:space="preserve">Anteparo</w:t>
             </w:r>
           </w:p>
         </w:tc>
@@ -24583,7 +24675,7 @@
                 <w:sz w:val="19"/>
                 <w:szCs w:val="19"/>
               </w:rPr>
-              <w:t xml:space="preserve">Leve</w:t>
+              <w:t xml:space="preserve">Média</w:t>
             </w:r>
           </w:p>
         </w:tc>
@@ -24611,7 +24703,7 @@
                 <w:sz w:val="19"/>
                 <w:szCs w:val="19"/>
               </w:rPr>
-              <w:t xml:space="preserve">A área vira terreno difícil, ou fica obscurecida, por uma rodada.</w:t>
+              <w:t xml:space="preserve">Deixa uma parede ou escudo com 10 × Classe de pontos de vida, por 1 minuto.</w:t>
             </w:r>
           </w:p>
         </w:tc>
@@ -24645,7 +24737,7 @@
                 <w:sz w:val="19"/>
                 <w:szCs w:val="19"/>
               </w:rPr>
-              <w:t xml:space="preserve">Anteparo</w:t>
+              <w:t xml:space="preserve">Prende</w:t>
             </w:r>
           </w:p>
         </w:tc>
@@ -24703,7 +24795,7 @@
                 <w:sz w:val="19"/>
                 <w:szCs w:val="19"/>
               </w:rPr>
-              <w:t xml:space="preserve">Deixa uma parede ou escudo com 10 × Classe de pontos de vida, por 1 minuto.</w:t>
+              <w:t xml:space="preserve">O alvo não sai do lugar até o fim do próximo turno dele. Ele pode gastar a ação pra tentar um Teste de Resistência e se soltar.</w:t>
             </w:r>
           </w:p>
         </w:tc>
@@ -24736,7 +24828,7 @@
                 <w:sz w:val="19"/>
                 <w:szCs w:val="19"/>
               </w:rPr>
-              <w:t xml:space="preserve">Prende</w:t>
+              <w:t xml:space="preserve">Cerca</w:t>
             </w:r>
           </w:p>
         </w:tc>
@@ -24764,7 +24856,7 @@
                 <w:sz w:val="19"/>
                 <w:szCs w:val="19"/>
               </w:rPr>
-              <w:t xml:space="preserve">Média</w:t>
+              <w:t xml:space="preserve">Leve</w:t>
             </w:r>
           </w:p>
         </w:tc>
@@ -24792,7 +24884,7 @@
                 <w:sz w:val="19"/>
                 <w:szCs w:val="19"/>
               </w:rPr>
-              <w:t xml:space="preserve">O alvo não sai do lugar até o fim do próximo turno dele. Ele pode gastar a ação pra tentar um Teste de Resistência e se soltar.</w:t>
+              <w:t xml:space="preserve">O alvo não consegue se aproximar de você até o fim do próximo turno dele.</w:t>
             </w:r>
           </w:p>
         </w:tc>
@@ -24826,7 +24918,7 @@
                 <w:sz w:val="19"/>
                 <w:szCs w:val="19"/>
               </w:rPr>
-              <w:t xml:space="preserve">Cerca</w:t>
+              <w:t xml:space="preserve">Puxa</w:t>
             </w:r>
           </w:p>
         </w:tc>
@@ -24855,7 +24947,7 @@
                 <w:sz w:val="19"/>
                 <w:szCs w:val="19"/>
               </w:rPr>
-              <w:t xml:space="preserve">Leve</w:t>
+              <w:t xml:space="preserve">Média</w:t>
             </w:r>
           </w:p>
         </w:tc>
@@ -24884,7 +24976,7 @@
                 <w:sz w:val="19"/>
                 <w:szCs w:val="19"/>
               </w:rPr>
-              <w:t xml:space="preserve">O alvo não consegue se aproximar de você até o fim do próximo turno dele.</w:t>
+              <w:t xml:space="preserve">Todo mundo na área é puxado 6 m na direção do centro.</w:t>
             </w:r>
           </w:p>
         </w:tc>
@@ -24917,7 +25009,7 @@
                 <w:sz w:val="19"/>
                 <w:szCs w:val="19"/>
               </w:rPr>
-              <w:t xml:space="preserve">Puxa</w:t>
+              <w:t xml:space="preserve">Desarma o Feitiço</w:t>
             </w:r>
           </w:p>
         </w:tc>
@@ -24952,98 +25044,6 @@
         <w:tc>
           <w:tcPr>
             <w:tcW w:type="dxa" w:w="5940"/>
-            <w:tcMar>
-              <w:top w:type="dxa" w:w="60"/>
-              <w:left w:type="dxa" w:w="110"/>
-              <w:bottom w:type="dxa" w:w="60"/>
-              <w:right w:type="dxa" w:w="110"/>
-            </w:tcMar>
-            <w:vAlign w:val="center"/>
-          </w:tcPr>
-          <w:p>
-            <w:pPr>
-              <w:spacing w:after="40" w:before="40" w:line="240"/>
-              <w:jc w:val="left"/>
-            </w:pPr>
-            <w:r>
-              <w:rPr>
-                <w:b w:val="false"/>
-                <w:bCs w:val="false"/>
-                <w:color w:val="1A1A1A"/>
-                <w:sz w:val="19"/>
-                <w:szCs w:val="19"/>
-              </w:rPr>
-              <w:t xml:space="preserve">Todo mundo na área é puxado 6 m na direção do centro.</w:t>
-            </w:r>
-          </w:p>
-        </w:tc>
-      </w:tr>
-      <w:tr>
-        <w:trPr>
-          <w:cantSplit/>
-        </w:trPr>
-        <w:tc>
-          <w:tcPr>
-            <w:tcW w:type="dxa" w:w="1890"/>
-            <w:shd w:fill="F7F4F6" w:color="auto" w:val="clear"/>
-            <w:tcMar>
-              <w:top w:type="dxa" w:w="60"/>
-              <w:left w:type="dxa" w:w="110"/>
-              <w:bottom w:type="dxa" w:w="60"/>
-              <w:right w:type="dxa" w:w="110"/>
-            </w:tcMar>
-            <w:vAlign w:val="center"/>
-          </w:tcPr>
-          <w:p>
-            <w:pPr>
-              <w:spacing w:after="40" w:before="40" w:line="240"/>
-              <w:jc w:val="left"/>
-            </w:pPr>
-            <w:r>
-              <w:rPr>
-                <w:b/>
-                <w:bCs/>
-                <w:color w:val="1A1A1A"/>
-                <w:sz w:val="19"/>
-                <w:szCs w:val="19"/>
-              </w:rPr>
-              <w:t xml:space="preserve">Desarma o Feitiço</w:t>
-            </w:r>
-          </w:p>
-        </w:tc>
-        <w:tc>
-          <w:tcPr>
-            <w:tcW w:type="dxa" w:w="1170"/>
-            <w:shd w:fill="F7F4F6" w:color="auto" w:val="clear"/>
-            <w:tcMar>
-              <w:top w:type="dxa" w:w="60"/>
-              <w:left w:type="dxa" w:w="110"/>
-              <w:bottom w:type="dxa" w:w="60"/>
-              <w:right w:type="dxa" w:w="110"/>
-            </w:tcMar>
-            <w:vAlign w:val="center"/>
-          </w:tcPr>
-          <w:p>
-            <w:pPr>
-              <w:spacing w:after="40" w:before="40" w:line="240"/>
-              <w:jc w:val="center"/>
-            </w:pPr>
-            <w:r>
-              <w:rPr>
-                <w:b w:val="false"/>
-                <w:bCs w:val="false"/>
-                <w:color w:val="1A1A1A"/>
-                <w:sz w:val="19"/>
-                <w:szCs w:val="19"/>
-              </w:rPr>
-              <w:t xml:space="preserve">Média</w:t>
-            </w:r>
-          </w:p>
-        </w:tc>
-        <w:tc>
-          <w:tcPr>
-            <w:tcW w:type="dxa" w:w="5940"/>
-            <w:shd w:fill="F7F4F6" w:color="auto" w:val="clear"/>
             <w:tcMar>
               <w:top w:type="dxa" w:w="60"/>
               <w:left w:type="dxa" w:w="110"/>
@@ -25093,17 +25093,45 @@
         <w:spacing w:after="140" w:before="0" w:line="276"/>
       </w:pPr>
       <w:r>
-        <w:t xml:space="preserve">As doze da lista acima nunca tiveram efeito escrito, e três novas entraram. Aqui está o que cada uma faz. </w:t>
+        <w:t xml:space="preserve">São catorze, e cada uma tem um </w:t>
       </w:r>
       <w:r>
         <w:rPr>
           <w:b/>
           <w:bCs/>
         </w:rPr>
-        <w:t xml:space="preserve">Uma condição dura uma rodada</w:t>
+        <w:t xml:space="preserve">nível</w:t>
       </w:r>
       <w:r>
-        <w:t xml:space="preserve">, como as linhas de Controle já diziam.</w:t>
+        <w:t xml:space="preserve">: Leve, Média ou Pesada. O nível faz duas coisas ao mesmo tempo — é o </w:t>
+      </w:r>
+      <w:r>
+        <w:rPr>
+          <w:b/>
+          <w:bCs/>
+        </w:rPr>
+        <w:t xml:space="preserve">preço</w:t>
+      </w:r>
+      <w:r>
+        <w:t xml:space="preserve"> da Melhoria Condição que aplica ela, e é o que custa em energia pra </w:t>
+      </w:r>
+      <w:r>
+        <w:rPr>
+          <w:b/>
+          <w:bCs/>
+        </w:rPr>
+        <w:t xml:space="preserve">tirar</w:t>
+      </w:r>
+      <w:r>
+        <w:t xml:space="preserve"> ela de alguém (1 ponto por nível). Uma condição dura uma rodada.</w:t>
+      </w:r>
+    </w:p>
+    <w:p>
+      <w:pPr>
+        <w:spacing w:after="140" w:before="0" w:line="276"/>
+      </w:pPr>
+      <w:r>
+        <w:t xml:space="preserve">As três tabelas abaixo são as catorze separadas por nível. Numa Classe 5, por exemplo, aplicar uma Leve custa 3 pontos, uma Média custa 5 e uma Pesada custa 8.</w:t>
       </w:r>
     </w:p>
     <w:tbl>
@@ -25152,7 +25180,7 @@
                 <w:sz w:val="18"/>
                 <w:szCs w:val="18"/>
               </w:rPr>
-              <w:t xml:space="preserve">Menor</w:t>
+              <w:t xml:space="preserve">Nível Leve</w:t>
             </w:r>
           </w:p>
         </w:tc>
@@ -25214,7 +25242,7 @@
                 <w:sz w:val="19"/>
                 <w:szCs w:val="19"/>
               </w:rPr>
-              <w:t xml:space="preserve">Derrubado</w:t>
+              <w:t xml:space="preserve">Lento</w:t>
             </w:r>
           </w:p>
         </w:tc>
@@ -25242,7 +25270,7 @@
                 <w:sz w:val="19"/>
                 <w:szCs w:val="19"/>
               </w:rPr>
-              <w:t xml:space="preserve">No chão. Só se move rastejando, desvantagem nos seus ataques, e quem ataca de até 1,5 m tem vantagem — de longe, desvantagem.</w:t>
+              <w:t xml:space="preserve">Deslocamento pela metade, e sem Ação Bônus.</w:t>
             </w:r>
           </w:p>
         </w:tc>
@@ -25276,7 +25304,7 @@
                 <w:sz w:val="19"/>
                 <w:szCs w:val="19"/>
               </w:rPr>
-              <w:t xml:space="preserve">Cego</w:t>
+              <w:t xml:space="preserve">Incapacitado</w:t>
             </w:r>
           </w:p>
         </w:tc>
@@ -25305,7 +25333,7 @@
                 <w:sz w:val="19"/>
                 <w:szCs w:val="19"/>
               </w:rPr>
-              <w:t xml:space="preserve">Não enxerga. Falha automático em teste que precise de vista, desvantagem nos seus ataques, vantagem para quem te ataca.</w:t>
+              <w:t xml:space="preserve">Você não pode Bloquear, e todo ataque corpo a corpo contra você é crítico.</w:t>
             </w:r>
           </w:p>
         </w:tc>
@@ -25338,7 +25366,7 @@
                 <w:sz w:val="19"/>
                 <w:szCs w:val="19"/>
               </w:rPr>
-              <w:t xml:space="preserve">Surdo</w:t>
+              <w:t xml:space="preserve">Derrubado</w:t>
             </w:r>
           </w:p>
         </w:tc>
@@ -25366,7 +25394,7 @@
                 <w:sz w:val="19"/>
                 <w:szCs w:val="19"/>
               </w:rPr>
-              <w:t xml:space="preserve">Não ouve. Falha automático em teste que precise de audição.</w:t>
+              <w:t xml:space="preserve">No chão. Só se move rastejando, desvantagem nos seus ataques, e quem ataca de até 1,5 m tem vantagem — de longe, desvantagem.</w:t>
             </w:r>
           </w:p>
         </w:tc>
@@ -25462,7 +25490,7 @@
                 <w:sz w:val="19"/>
                 <w:szCs w:val="19"/>
               </w:rPr>
-              <w:t xml:space="preserve">Impedido</w:t>
+              <w:t xml:space="preserve">Desarmado</w:t>
             </w:r>
           </w:p>
         </w:tc>
@@ -25490,7 +25518,7 @@
                 <w:sz w:val="19"/>
                 <w:szCs w:val="19"/>
               </w:rPr>
-              <w:t xml:space="preserve">Deslocamento 0, desvantagem nos seus ataques e no Teste de Resistência Físico, e vantagem para quem te ataca.</w:t>
+              <w:t xml:space="preserve">A sua arma está no chão ou na mão de outro. Você bate desarmado até pegar de volta.</w:t>
             </w:r>
           </w:p>
         </w:tc>
@@ -25524,7 +25552,7 @@
                 <w:sz w:val="19"/>
                 <w:szCs w:val="19"/>
               </w:rPr>
-              <w:t xml:space="preserve">Envenenado</w:t>
+              <w:t xml:space="preserve">Surdo</w:t>
             </w:r>
           </w:p>
         </w:tc>
@@ -25553,192 +25581,7 @@
                 <w:sz w:val="19"/>
                 <w:szCs w:val="19"/>
               </w:rPr>
-              <w:t xml:space="preserve">Desvantagem nos seus ataques e em todo teste de perícia.</w:t>
-            </w:r>
-          </w:p>
-        </w:tc>
-      </w:tr>
-      <w:tr>
-        <w:trPr>
-          <w:cantSplit/>
-        </w:trPr>
-        <w:tc>
-          <w:tcPr>
-            <w:tcW w:type="dxa" w:w="2200"/>
-            <w:tcMar>
-              <w:top w:type="dxa" w:w="60"/>
-              <w:left w:type="dxa" w:w="110"/>
-              <w:bottom w:type="dxa" w:w="60"/>
-              <w:right w:type="dxa" w:w="110"/>
-            </w:tcMar>
-            <w:vAlign w:val="center"/>
-          </w:tcPr>
-          <w:p>
-            <w:pPr>
-              <w:spacing w:after="40" w:before="40" w:line="240"/>
-              <w:jc w:val="left"/>
-            </w:pPr>
-            <w:r>
-              <w:rPr>
-                <w:b/>
-                <w:bCs/>
-                <w:color w:val="1A1A1A"/>
-                <w:sz w:val="19"/>
-                <w:szCs w:val="19"/>
-              </w:rPr>
-              <w:t xml:space="preserve">Lento</w:t>
-            </w:r>
-          </w:p>
-        </w:tc>
-        <w:tc>
-          <w:tcPr>
-            <w:tcW w:type="dxa" w:w="6800"/>
-            <w:tcMar>
-              <w:top w:type="dxa" w:w="60"/>
-              <w:left w:type="dxa" w:w="110"/>
-              <w:bottom w:type="dxa" w:w="60"/>
-              <w:right w:type="dxa" w:w="110"/>
-            </w:tcMar>
-            <w:vAlign w:val="center"/>
-          </w:tcPr>
-          <w:p>
-            <w:pPr>
-              <w:spacing w:after="40" w:before="40" w:line="240"/>
-              <w:jc w:val="left"/>
-            </w:pPr>
-            <w:r>
-              <w:rPr>
-                <w:b w:val="false"/>
-                <w:bCs w:val="false"/>
-                <w:color w:val="1A1A1A"/>
-                <w:sz w:val="19"/>
-                <w:szCs w:val="19"/>
-              </w:rPr>
-              <w:t xml:space="preserve">Deslocamento pela metade, e sem Ação Bônus.</w:t>
-            </w:r>
-          </w:p>
-        </w:tc>
-      </w:tr>
-      <w:tr>
-        <w:trPr>
-          <w:cantSplit/>
-        </w:trPr>
-        <w:tc>
-          <w:tcPr>
-            <w:tcW w:type="dxa" w:w="2200"/>
-            <w:shd w:fill="F7F4F6" w:color="auto" w:val="clear"/>
-            <w:tcMar>
-              <w:top w:type="dxa" w:w="60"/>
-              <w:left w:type="dxa" w:w="110"/>
-              <w:bottom w:type="dxa" w:w="60"/>
-              <w:right w:type="dxa" w:w="110"/>
-            </w:tcMar>
-            <w:vAlign w:val="center"/>
-          </w:tcPr>
-          <w:p>
-            <w:pPr>
-              <w:spacing w:after="40" w:before="40" w:line="240"/>
-              <w:jc w:val="left"/>
-            </w:pPr>
-            <w:r>
-              <w:rPr>
-                <w:b/>
-                <w:bCs/>
-                <w:color w:val="1A1A1A"/>
-                <w:sz w:val="19"/>
-                <w:szCs w:val="19"/>
-              </w:rPr>
-              <w:t xml:space="preserve">Desarmado</w:t>
-            </w:r>
-          </w:p>
-        </w:tc>
-        <w:tc>
-          <w:tcPr>
-            <w:tcW w:type="dxa" w:w="6800"/>
-            <w:shd w:fill="F7F4F6" w:color="auto" w:val="clear"/>
-            <w:tcMar>
-              <w:top w:type="dxa" w:w="60"/>
-              <w:left w:type="dxa" w:w="110"/>
-              <w:bottom w:type="dxa" w:w="60"/>
-              <w:right w:type="dxa" w:w="110"/>
-            </w:tcMar>
-            <w:vAlign w:val="center"/>
-          </w:tcPr>
-          <w:p>
-            <w:pPr>
-              <w:spacing w:after="40" w:before="40" w:line="240"/>
-              <w:jc w:val="left"/>
-            </w:pPr>
-            <w:r>
-              <w:rPr>
-                <w:b w:val="false"/>
-                <w:bCs w:val="false"/>
-                <w:color w:val="1A1A1A"/>
-                <w:sz w:val="19"/>
-                <w:szCs w:val="19"/>
-              </w:rPr>
-              <w:t xml:space="preserve">A sua arma está no chão ou na mão de outro. Você bate desarmado até pegar de volta.</w:t>
-            </w:r>
-          </w:p>
-        </w:tc>
-      </w:tr>
-      <w:tr>
-        <w:trPr>
-          <w:cantSplit/>
-        </w:trPr>
-        <w:tc>
-          <w:tcPr>
-            <w:tcW w:type="dxa" w:w="2200"/>
-            <w:tcMar>
-              <w:top w:type="dxa" w:w="60"/>
-              <w:left w:type="dxa" w:w="110"/>
-              <w:bottom w:type="dxa" w:w="60"/>
-              <w:right w:type="dxa" w:w="110"/>
-            </w:tcMar>
-            <w:vAlign w:val="center"/>
-          </w:tcPr>
-          <w:p>
-            <w:pPr>
-              <w:spacing w:after="40" w:before="40" w:line="240"/>
-              <w:jc w:val="left"/>
-            </w:pPr>
-            <w:r>
-              <w:rPr>
-                <w:b/>
-                <w:bCs/>
-                <w:color w:val="1A1A1A"/>
-                <w:sz w:val="19"/>
-                <w:szCs w:val="19"/>
-              </w:rPr>
-              <w:t xml:space="preserve">Calado</w:t>
-            </w:r>
-          </w:p>
-        </w:tc>
-        <w:tc>
-          <w:tcPr>
-            <w:tcW w:type="dxa" w:w="6800"/>
-            <w:tcMar>
-              <w:top w:type="dxa" w:w="60"/>
-              <w:left w:type="dxa" w:w="110"/>
-              <w:bottom w:type="dxa" w:w="60"/>
-              <w:right w:type="dxa" w:w="110"/>
-            </w:tcMar>
-            <w:vAlign w:val="center"/>
-          </w:tcPr>
-          <w:p>
-            <w:pPr>
-              <w:spacing w:after="40" w:before="40" w:line="240"/>
-              <w:jc w:val="left"/>
-            </w:pPr>
-            <w:r>
-              <w:rPr>
-                <w:b w:val="false"/>
-                <w:bCs w:val="false"/>
-                <w:color w:val="1A1A1A"/>
-                <w:sz w:val="19"/>
-                <w:szCs w:val="19"/>
-              </w:rPr>
-              <w:t xml:space="preserve">Você não conjura. Nada que precise de voz, gesto ou Selo sai.</w:t>
+              <w:t xml:space="preserve">Não ouve. Falha automático em teste que precise de audição, e −2 na iniciativa.</w:t>
             </w:r>
           </w:p>
         </w:tc>
@@ -25790,7 +25633,7 @@
                 <w:sz w:val="18"/>
                 <w:szCs w:val="18"/>
               </w:rPr>
-              <w:t xml:space="preserve">Maior</w:t>
+              <w:t xml:space="preserve">Nível Média</w:t>
             </w:r>
           </w:p>
         </w:tc>
@@ -25852,7 +25695,7 @@
                 <w:sz w:val="19"/>
                 <w:szCs w:val="19"/>
               </w:rPr>
-              <w:t xml:space="preserve">Amedrontado</w:t>
+              <w:t xml:space="preserve">Calado</w:t>
             </w:r>
           </w:p>
         </w:tc>
@@ -25880,7 +25723,7 @@
                 <w:sz w:val="19"/>
                 <w:szCs w:val="19"/>
               </w:rPr>
-              <w:t xml:space="preserve">Desvantagem em ataque e teste enquanto enxergar a fonte do medo, e você não se aproxima dela de vontade própria.</w:t>
+              <w:t xml:space="preserve">Você não conjura. Nada que precise de voz, gesto ou Selo sai.</w:t>
             </w:r>
           </w:p>
         </w:tc>
@@ -25948,63 +25791,83 @@
           </w:p>
         </w:tc>
       </w:tr>
+    </w:tbl>
+    <w:tbl>
+      <w:tblPr>
+        <w:tblW w:type="dxa" w:w="9000"/>
+        <w:tblBorders>
+          <w:top w:val="single" w:color="C8C8C8" w:sz="4"/>
+          <w:left w:val="single" w:color="C8C8C8" w:sz="4"/>
+          <w:bottom w:val="single" w:color="C8C8C8" w:sz="4"/>
+          <w:right w:val="single" w:color="C8C8C8" w:sz="4"/>
+          <w:insideH w:val="single" w:color="C8C8C8" w:sz="2"/>
+          <w:insideV w:val="single" w:color="C8C8C8" w:sz="2"/>
+        </w:tblBorders>
+      </w:tblPr>
+      <w:tblGrid>
+        <w:gridCol w:w="2200"/>
+        <w:gridCol w:w="6800"/>
+      </w:tblGrid>
       <w:tr>
         <w:trPr>
           <w:cantSplit/>
+          <w:tblHeader/>
         </w:trPr>
         <w:tc>
           <w:tcPr>
             <w:tcW w:type="dxa" w:w="2200"/>
-            <w:tcMar>
-              <w:top w:type="dxa" w:w="60"/>
-              <w:left w:type="dxa" w:w="110"/>
-              <w:bottom w:type="dxa" w:w="60"/>
-              <w:right w:type="dxa" w:w="110"/>
-            </w:tcMar>
-            <w:vAlign w:val="center"/>
-          </w:tcPr>
-          <w:p>
-            <w:pPr>
-              <w:spacing w:after="40" w:before="40" w:line="240"/>
-              <w:jc w:val="left"/>
-            </w:pPr>
-            <w:r>
-              <w:rPr>
-                <w:b/>
-                <w:bCs/>
-                <w:color w:val="1A1A1A"/>
-                <w:sz w:val="19"/>
-                <w:szCs w:val="19"/>
-              </w:rPr>
-              <w:t xml:space="preserve">Atordoado</w:t>
+            <w:shd w:fill="4E1230" w:color="auto" w:val="clear"/>
+            <w:tcMar>
+              <w:top w:type="dxa" w:w="60"/>
+              <w:left w:type="dxa" w:w="110"/>
+              <w:bottom w:type="dxa" w:w="60"/>
+              <w:right w:type="dxa" w:w="110"/>
+            </w:tcMar>
+            <w:vAlign w:val="center"/>
+          </w:tcPr>
+          <w:p>
+            <w:pPr>
+              <w:spacing w:after="40" w:before="40" w:line="240"/>
+              <w:jc w:val="left"/>
+            </w:pPr>
+            <w:r>
+              <w:rPr>
+                <w:b/>
+                <w:bCs/>
+                <w:color w:val="FFFFFF"/>
+                <w:sz w:val="18"/>
+                <w:szCs w:val="18"/>
+              </w:rPr>
+              <w:t xml:space="preserve">Nível Pesada</w:t>
             </w:r>
           </w:p>
         </w:tc>
         <w:tc>
           <w:tcPr>
             <w:tcW w:type="dxa" w:w="6800"/>
-            <w:tcMar>
-              <w:top w:type="dxa" w:w="60"/>
-              <w:left w:type="dxa" w:w="110"/>
-              <w:bottom w:type="dxa" w:w="60"/>
-              <w:right w:type="dxa" w:w="110"/>
-            </w:tcMar>
-            <w:vAlign w:val="center"/>
-          </w:tcPr>
-          <w:p>
-            <w:pPr>
-              <w:spacing w:after="40" w:before="40" w:line="240"/>
-              <w:jc w:val="left"/>
-            </w:pPr>
-            <w:r>
-              <w:rPr>
-                <w:b w:val="false"/>
-                <w:bCs w:val="false"/>
-                <w:color w:val="1A1A1A"/>
-                <w:sz w:val="19"/>
-                <w:szCs w:val="19"/>
-              </w:rPr>
-              <w:t xml:space="preserve">Você perde a Ação Padrão e não usa reação. Quem tem mais de uma Ação Padrão no turno perde UMA, não todas.</w:t>
+            <w:shd w:fill="4E1230" w:color="auto" w:val="clear"/>
+            <w:tcMar>
+              <w:top w:type="dxa" w:w="60"/>
+              <w:left w:type="dxa" w:w="110"/>
+              <w:bottom w:type="dxa" w:w="60"/>
+              <w:right w:type="dxa" w:w="110"/>
+            </w:tcMar>
+            <w:vAlign w:val="center"/>
+          </w:tcPr>
+          <w:p>
+            <w:pPr>
+              <w:spacing w:after="40" w:before="40" w:line="240"/>
+              <w:jc w:val="center"/>
+            </w:pPr>
+            <w:r>
+              <w:rPr>
+                <w:b/>
+                <w:bCs/>
+                <w:color w:val="FFFFFF"/>
+                <w:sz w:val="18"/>
+                <w:szCs w:val="18"/>
+              </w:rPr>
+              <w:t xml:space="preserve">O que faz</w:t>
             </w:r>
           </w:p>
         </w:tc>
@@ -26016,58 +25879,56 @@
         <w:tc>
           <w:tcPr>
             <w:tcW w:type="dxa" w:w="2200"/>
-            <w:shd w:fill="F7F4F6" w:color="auto" w:val="clear"/>
-            <w:tcMar>
-              <w:top w:type="dxa" w:w="60"/>
-              <w:left w:type="dxa" w:w="110"/>
-              <w:bottom w:type="dxa" w:w="60"/>
-              <w:right w:type="dxa" w:w="110"/>
-            </w:tcMar>
-            <w:vAlign w:val="center"/>
-          </w:tcPr>
-          <w:p>
-            <w:pPr>
-              <w:spacing w:after="40" w:before="40" w:line="240"/>
-              <w:jc w:val="left"/>
-            </w:pPr>
-            <w:r>
-              <w:rPr>
-                <w:b/>
-                <w:bCs/>
-                <w:color w:val="1A1A1A"/>
-                <w:sz w:val="19"/>
-                <w:szCs w:val="19"/>
-              </w:rPr>
-              <w:t xml:space="preserve">Incapacitado</w:t>
+            <w:tcMar>
+              <w:top w:type="dxa" w:w="60"/>
+              <w:left w:type="dxa" w:w="110"/>
+              <w:bottom w:type="dxa" w:w="60"/>
+              <w:right w:type="dxa" w:w="110"/>
+            </w:tcMar>
+            <w:vAlign w:val="center"/>
+          </w:tcPr>
+          <w:p>
+            <w:pPr>
+              <w:spacing w:after="40" w:before="40" w:line="240"/>
+              <w:jc w:val="left"/>
+            </w:pPr>
+            <w:r>
+              <w:rPr>
+                <w:b/>
+                <w:bCs/>
+                <w:color w:val="1A1A1A"/>
+                <w:sz w:val="19"/>
+                <w:szCs w:val="19"/>
+              </w:rPr>
+              <w:t xml:space="preserve">Petrificado</w:t>
             </w:r>
           </w:p>
         </w:tc>
         <w:tc>
           <w:tcPr>
             <w:tcW w:type="dxa" w:w="6800"/>
-            <w:shd w:fill="F7F4F6" w:color="auto" w:val="clear"/>
-            <w:tcMar>
-              <w:top w:type="dxa" w:w="60"/>
-              <w:left w:type="dxa" w:w="110"/>
-              <w:bottom w:type="dxa" w:w="60"/>
-              <w:right w:type="dxa" w:w="110"/>
-            </w:tcMar>
-            <w:vAlign w:val="center"/>
-          </w:tcPr>
-          <w:p>
-            <w:pPr>
-              <w:spacing w:after="40" w:before="40" w:line="240"/>
-              <w:jc w:val="left"/>
-            </w:pPr>
-            <w:r>
-              <w:rPr>
-                <w:b w:val="false"/>
-                <w:bCs w:val="false"/>
-                <w:color w:val="1A1A1A"/>
-                <w:sz w:val="19"/>
-                <w:szCs w:val="19"/>
-              </w:rPr>
-              <w:t xml:space="preserve">Você não pode Bloquear, e todo ataque corpo a corpo contra você é crítico.</w:t>
+            <w:tcMar>
+              <w:top w:type="dxa" w:w="60"/>
+              <w:left w:type="dxa" w:w="110"/>
+              <w:bottom w:type="dxa" w:w="60"/>
+              <w:right w:type="dxa" w:w="110"/>
+            </w:tcMar>
+            <w:vAlign w:val="center"/>
+          </w:tcPr>
+          <w:p>
+            <w:pPr>
+              <w:spacing w:after="40" w:before="40" w:line="240"/>
+              <w:jc w:val="left"/>
+            </w:pPr>
+            <w:r>
+              <w:rPr>
+                <w:b w:val="false"/>
+                <w:bCs w:val="false"/>
+                <w:color w:val="1A1A1A"/>
+                <w:sz w:val="19"/>
+                <w:szCs w:val="19"/>
+              </w:rPr>
+              <w:t xml:space="preserve">Virou pedra. Incapacitado, deslocamento 0, sem perceber o que está em volta, vantagem para quem te ataca — e resistência a todo dano.</w:t>
             </w:r>
           </w:p>
         </w:tc>
@@ -26079,56 +25940,306 @@
         <w:tc>
           <w:tcPr>
             <w:tcW w:type="dxa" w:w="2200"/>
-            <w:tcMar>
-              <w:top w:type="dxa" w:w="60"/>
-              <w:left w:type="dxa" w:w="110"/>
-              <w:bottom w:type="dxa" w:w="60"/>
-              <w:right w:type="dxa" w:w="110"/>
-            </w:tcMar>
-            <w:vAlign w:val="center"/>
-          </w:tcPr>
-          <w:p>
-            <w:pPr>
-              <w:spacing w:after="40" w:before="40" w:line="240"/>
-              <w:jc w:val="left"/>
-            </w:pPr>
-            <w:r>
-              <w:rPr>
-                <w:b/>
-                <w:bCs/>
-                <w:color w:val="1A1A1A"/>
-                <w:sz w:val="19"/>
-                <w:szCs w:val="19"/>
-              </w:rPr>
-              <w:t xml:space="preserve">Petrificado</w:t>
+            <w:shd w:fill="F7F4F6" w:color="auto" w:val="clear"/>
+            <w:tcMar>
+              <w:top w:type="dxa" w:w="60"/>
+              <w:left w:type="dxa" w:w="110"/>
+              <w:bottom w:type="dxa" w:w="60"/>
+              <w:right w:type="dxa" w:w="110"/>
+            </w:tcMar>
+            <w:vAlign w:val="center"/>
+          </w:tcPr>
+          <w:p>
+            <w:pPr>
+              <w:spacing w:after="40" w:before="40" w:line="240"/>
+              <w:jc w:val="left"/>
+            </w:pPr>
+            <w:r>
+              <w:rPr>
+                <w:b/>
+                <w:bCs/>
+                <w:color w:val="1A1A1A"/>
+                <w:sz w:val="19"/>
+                <w:szCs w:val="19"/>
+              </w:rPr>
+              <w:t xml:space="preserve">Impedido</w:t>
             </w:r>
           </w:p>
         </w:tc>
         <w:tc>
           <w:tcPr>
             <w:tcW w:type="dxa" w:w="6800"/>
-            <w:tcMar>
-              <w:top w:type="dxa" w:w="60"/>
-              <w:left w:type="dxa" w:w="110"/>
-              <w:bottom w:type="dxa" w:w="60"/>
-              <w:right w:type="dxa" w:w="110"/>
-            </w:tcMar>
-            <w:vAlign w:val="center"/>
-          </w:tcPr>
-          <w:p>
-            <w:pPr>
-              <w:spacing w:after="40" w:before="40" w:line="240"/>
-              <w:jc w:val="left"/>
-            </w:pPr>
-            <w:r>
-              <w:rPr>
-                <w:b w:val="false"/>
-                <w:bCs w:val="false"/>
-                <w:color w:val="1A1A1A"/>
-                <w:sz w:val="19"/>
-                <w:szCs w:val="19"/>
-              </w:rPr>
-              <w:t xml:space="preserve">Virou pedra. Incapacitado, deslocamento 0, sem perceber o que está em volta, vantagem para quem te ataca — e resistência a todo dano.</w:t>
+            <w:shd w:fill="F7F4F6" w:color="auto" w:val="clear"/>
+            <w:tcMar>
+              <w:top w:type="dxa" w:w="60"/>
+              <w:left w:type="dxa" w:w="110"/>
+              <w:bottom w:type="dxa" w:w="60"/>
+              <w:right w:type="dxa" w:w="110"/>
+            </w:tcMar>
+            <w:vAlign w:val="center"/>
+          </w:tcPr>
+          <w:p>
+            <w:pPr>
+              <w:spacing w:after="40" w:before="40" w:line="240"/>
+              <w:jc w:val="left"/>
+            </w:pPr>
+            <w:r>
+              <w:rPr>
+                <w:b w:val="false"/>
+                <w:bCs w:val="false"/>
+                <w:color w:val="1A1A1A"/>
+                <w:sz w:val="19"/>
+                <w:szCs w:val="19"/>
+              </w:rPr>
+              <w:t xml:space="preserve">Deslocamento 0, desvantagem nos seus ataques e no Teste de Resistência Físico, e vantagem para quem te ataca.</w:t>
+            </w:r>
+          </w:p>
+        </w:tc>
+      </w:tr>
+      <w:tr>
+        <w:trPr>
+          <w:cantSplit/>
+        </w:trPr>
+        <w:tc>
+          <w:tcPr>
+            <w:tcW w:type="dxa" w:w="2200"/>
+            <w:tcMar>
+              <w:top w:type="dxa" w:w="60"/>
+              <w:left w:type="dxa" w:w="110"/>
+              <w:bottom w:type="dxa" w:w="60"/>
+              <w:right w:type="dxa" w:w="110"/>
+            </w:tcMar>
+            <w:vAlign w:val="center"/>
+          </w:tcPr>
+          <w:p>
+            <w:pPr>
+              <w:spacing w:after="40" w:before="40" w:line="240"/>
+              <w:jc w:val="left"/>
+            </w:pPr>
+            <w:r>
+              <w:rPr>
+                <w:b/>
+                <w:bCs/>
+                <w:color w:val="1A1A1A"/>
+                <w:sz w:val="19"/>
+                <w:szCs w:val="19"/>
+              </w:rPr>
+              <w:t xml:space="preserve">Cego</w:t>
+            </w:r>
+          </w:p>
+        </w:tc>
+        <w:tc>
+          <w:tcPr>
+            <w:tcW w:type="dxa" w:w="6800"/>
+            <w:tcMar>
+              <w:top w:type="dxa" w:w="60"/>
+              <w:left w:type="dxa" w:w="110"/>
+              <w:bottom w:type="dxa" w:w="60"/>
+              <w:right w:type="dxa" w:w="110"/>
+            </w:tcMar>
+            <w:vAlign w:val="center"/>
+          </w:tcPr>
+          <w:p>
+            <w:pPr>
+              <w:spacing w:after="40" w:before="40" w:line="240"/>
+              <w:jc w:val="left"/>
+            </w:pPr>
+            <w:r>
+              <w:rPr>
+                <w:b w:val="false"/>
+                <w:bCs w:val="false"/>
+                <w:color w:val="1A1A1A"/>
+                <w:sz w:val="19"/>
+                <w:szCs w:val="19"/>
+              </w:rPr>
+              <w:t xml:space="preserve">Não enxerga. Falha automático em teste que precise de vista, desvantagem nos seus ataques, vantagem para quem te ataca.</w:t>
+            </w:r>
+          </w:p>
+        </w:tc>
+      </w:tr>
+      <w:tr>
+        <w:trPr>
+          <w:cantSplit/>
+        </w:trPr>
+        <w:tc>
+          <w:tcPr>
+            <w:tcW w:type="dxa" w:w="2200"/>
+            <w:shd w:fill="F7F4F6" w:color="auto" w:val="clear"/>
+            <w:tcMar>
+              <w:top w:type="dxa" w:w="60"/>
+              <w:left w:type="dxa" w:w="110"/>
+              <w:bottom w:type="dxa" w:w="60"/>
+              <w:right w:type="dxa" w:w="110"/>
+            </w:tcMar>
+            <w:vAlign w:val="center"/>
+          </w:tcPr>
+          <w:p>
+            <w:pPr>
+              <w:spacing w:after="40" w:before="40" w:line="240"/>
+              <w:jc w:val="left"/>
+            </w:pPr>
+            <w:r>
+              <w:rPr>
+                <w:b/>
+                <w:bCs/>
+                <w:color w:val="1A1A1A"/>
+                <w:sz w:val="19"/>
+                <w:szCs w:val="19"/>
+              </w:rPr>
+              <w:t xml:space="preserve">Amedrontado</w:t>
+            </w:r>
+          </w:p>
+        </w:tc>
+        <w:tc>
+          <w:tcPr>
+            <w:tcW w:type="dxa" w:w="6800"/>
+            <w:shd w:fill="F7F4F6" w:color="auto" w:val="clear"/>
+            <w:tcMar>
+              <w:top w:type="dxa" w:w="60"/>
+              <w:left w:type="dxa" w:w="110"/>
+              <w:bottom w:type="dxa" w:w="60"/>
+              <w:right w:type="dxa" w:w="110"/>
+            </w:tcMar>
+            <w:vAlign w:val="center"/>
+          </w:tcPr>
+          <w:p>
+            <w:pPr>
+              <w:spacing w:after="40" w:before="40" w:line="240"/>
+              <w:jc w:val="left"/>
+            </w:pPr>
+            <w:r>
+              <w:rPr>
+                <w:b w:val="false"/>
+                <w:bCs w:val="false"/>
+                <w:color w:val="1A1A1A"/>
+                <w:sz w:val="19"/>
+                <w:szCs w:val="19"/>
+              </w:rPr>
+              <w:t xml:space="preserve">Desvantagem em ataque e teste enquanto enxergar a fonte do medo, e você não se aproxima dela de vontade própria.</w:t>
+            </w:r>
+          </w:p>
+        </w:tc>
+      </w:tr>
+      <w:tr>
+        <w:trPr>
+          <w:cantSplit/>
+        </w:trPr>
+        <w:tc>
+          <w:tcPr>
+            <w:tcW w:type="dxa" w:w="2200"/>
+            <w:tcMar>
+              <w:top w:type="dxa" w:w="60"/>
+              <w:left w:type="dxa" w:w="110"/>
+              <w:bottom w:type="dxa" w:w="60"/>
+              <w:right w:type="dxa" w:w="110"/>
+            </w:tcMar>
+            <w:vAlign w:val="center"/>
+          </w:tcPr>
+          <w:p>
+            <w:pPr>
+              <w:spacing w:after="40" w:before="40" w:line="240"/>
+              <w:jc w:val="left"/>
+            </w:pPr>
+            <w:r>
+              <w:rPr>
+                <w:b/>
+                <w:bCs/>
+                <w:color w:val="1A1A1A"/>
+                <w:sz w:val="19"/>
+                <w:szCs w:val="19"/>
+              </w:rPr>
+              <w:t xml:space="preserve">Envenenado</w:t>
+            </w:r>
+          </w:p>
+        </w:tc>
+        <w:tc>
+          <w:tcPr>
+            <w:tcW w:type="dxa" w:w="6800"/>
+            <w:tcMar>
+              <w:top w:type="dxa" w:w="60"/>
+              <w:left w:type="dxa" w:w="110"/>
+              <w:bottom w:type="dxa" w:w="60"/>
+              <w:right w:type="dxa" w:w="110"/>
+            </w:tcMar>
+            <w:vAlign w:val="center"/>
+          </w:tcPr>
+          <w:p>
+            <w:pPr>
+              <w:spacing w:after="40" w:before="40" w:line="240"/>
+              <w:jc w:val="left"/>
+            </w:pPr>
+            <w:r>
+              <w:rPr>
+                <w:b w:val="false"/>
+                <w:bCs w:val="false"/>
+                <w:color w:val="1A1A1A"/>
+                <w:sz w:val="19"/>
+                <w:szCs w:val="19"/>
+              </w:rPr>
+              <w:t xml:space="preserve">Desvantagem nos seus ataques e em todo teste de perícia.</w:t>
+            </w:r>
+          </w:p>
+        </w:tc>
+      </w:tr>
+      <w:tr>
+        <w:trPr>
+          <w:cantSplit/>
+        </w:trPr>
+        <w:tc>
+          <w:tcPr>
+            <w:tcW w:type="dxa" w:w="2200"/>
+            <w:shd w:fill="F7F4F6" w:color="auto" w:val="clear"/>
+            <w:tcMar>
+              <w:top w:type="dxa" w:w="60"/>
+              <w:left w:type="dxa" w:w="110"/>
+              <w:bottom w:type="dxa" w:w="60"/>
+              <w:right w:type="dxa" w:w="110"/>
+            </w:tcMar>
+            <w:vAlign w:val="center"/>
+          </w:tcPr>
+          <w:p>
+            <w:pPr>
+              <w:spacing w:after="40" w:before="40" w:line="240"/>
+              <w:jc w:val="left"/>
+            </w:pPr>
+            <w:r>
+              <w:rPr>
+                <w:b/>
+                <w:bCs/>
+                <w:color w:val="1A1A1A"/>
+                <w:sz w:val="19"/>
+                <w:szCs w:val="19"/>
+              </w:rPr>
+              <w:t xml:space="preserve">Atordoado</w:t>
+            </w:r>
+          </w:p>
+        </w:tc>
+        <w:tc>
+          <w:tcPr>
+            <w:tcW w:type="dxa" w:w="6800"/>
+            <w:shd w:fill="F7F4F6" w:color="auto" w:val="clear"/>
+            <w:tcMar>
+              <w:top w:type="dxa" w:w="60"/>
+              <w:left w:type="dxa" w:w="110"/>
+              <w:bottom w:type="dxa" w:w="60"/>
+              <w:right w:type="dxa" w:w="110"/>
+            </w:tcMar>
+            <w:vAlign w:val="center"/>
+          </w:tcPr>
+          <w:p>
+            <w:pPr>
+              <w:spacing w:after="40" w:before="40" w:line="240"/>
+              <w:jc w:val="left"/>
+            </w:pPr>
+            <w:r>
+              <w:rPr>
+                <w:b w:val="false"/>
+                <w:bCs w:val="false"/>
+                <w:color w:val="1A1A1A"/>
+                <w:sz w:val="19"/>
+                <w:szCs w:val="19"/>
+              </w:rPr>
+              <w:t xml:space="preserve">Você perde a Ação Padrão e não usa reação. Quem tem mais de uma Ação Padrão no turno perde UMA, não todas.</w:t>
             </w:r>
           </w:p>
         </w:tc>
@@ -26183,7 +26294,7 @@
                 <w:sz w:val="18"/>
                 <w:szCs w:val="18"/>
               </w:rPr>
-              <w:t xml:space="preserve">ATORDOADO E INCAPACITADO ATACAM EIXOS DIFERENTES, E NÃO SE EMPILHAM</w:t>
+              <w:t xml:space="preserve">POR QUE AS TRÊS TABELAS NÃO SÃO "MENORES" E "MAIORES"</w:t>
             </w:r>
           </w:p>
           <w:p>
@@ -26195,7 +26306,7 @@
                 <w:sz w:val="20"/>
                 <w:szCs w:val="20"/>
               </w:rPr>
-              <w:t xml:space="preserve">Atordoado tira PARTE do turno: uma Ação Padrão e a reação. Você continua se defendendo.</w:t>
+              <w:t xml:space="preserve">Até a v7.8 as condições eram vendidas em dois pacotes: Condição Menor por Média e Condição Maior por Pesada. Um preço só, para coisas muito diferentes.</w:t>
             </w:r>
           </w:p>
           <w:p>
@@ -26207,31 +26318,19 @@
                 <w:sz w:val="20"/>
                 <w:szCs w:val="20"/>
               </w:rPr>
-              <w:t xml:space="preserve">Incapacitado não tira turno nenhum — tira a DEFESA. Você age e não se protege.</w:t>
-            </w:r>
-          </w:p>
-          <w:p>
-            <w:pPr>
-              <w:spacing w:after="110" w:line="268"/>
+              <w:t xml:space="preserve">A conta mediu as catorze e o espalhamento dentro de um pacote chegava a dezessete vezes: o Impedido custava o mesmo que o Surdo, e o Incapacitado custava o mesmo que o Petrificado.</w:t>
+            </w:r>
+          </w:p>
+          <w:p>
+            <w:pPr>
+              <w:spacing w:after="20" w:line="268"/>
             </w:pPr>
             <w:r>
               <w:rPr>
                 <w:sz w:val="20"/>
                 <w:szCs w:val="20"/>
               </w:rPr>
-              <w:t xml:space="preserve">Uma Condição Maior custa Pesada e você escolhe o eixo: tirar o que ele faz, ou tirar o que protege ele.</w:t>
-            </w:r>
-          </w:p>
-          <w:p>
-            <w:pPr>
-              <w:spacing w:after="20" w:line="268"/>
-            </w:pPr>
-            <w:r>
-              <w:rPr>
-                <w:sz w:val="20"/>
-                <w:szCs w:val="20"/>
-              </w:rPr>
-              <w:t xml:space="preserve">O Atordoado cobra uma Ação Padrão só de propósito: um chefe age mais de uma vez por rodada, e apagar o turno dele com uma linha de Controle sairia barato demais.</w:t>
+              <w:t xml:space="preserve">Agora cada condição custa o que ela vale. Dez das catorze estavam no degrau errado — três eram baratas demais e sete eram caras demais.</w:t>
             </w:r>
           </w:p>
         </w:tc>
@@ -26261,6 +26360,109 @@
             <w:tcW w:type="dxa" w:w="9000"/>
             <w:tcBorders>
               <w:top w:val="nil"/>
+              <w:left w:val="single" w:color="4E1230" w:sz="18"/>
+              <w:bottom w:val="nil"/>
+              <w:right w:val="nil"/>
+            </w:tcBorders>
+            <w:shd w:fill="F4F1EC" w:color="auto" w:val="clear"/>
+            <w:tcMar>
+              <w:top w:type="dxa" w:w="160"/>
+              <w:left w:type="dxa" w:w="220"/>
+              <w:bottom w:type="dxa" w:w="160"/>
+              <w:right w:type="dxa" w:w="220"/>
+            </w:tcMar>
+          </w:tcPr>
+          <w:p>
+            <w:pPr>
+              <w:spacing w:after="100" w:before="20"/>
+            </w:pPr>
+            <w:r>
+              <w:rPr>
+                <w:rFonts w:ascii="Georgia" w:cs="Georgia" w:eastAsia="Georgia" w:hAnsi="Georgia"/>
+                <w:b/>
+                <w:bCs/>
+                <w:color w:val="4E1230"/>
+                <w:sz w:val="18"/>
+                <w:szCs w:val="18"/>
+              </w:rPr>
+              <w:t xml:space="preserve">ATORDOADO E INCAPACITADO ATACAM EIXOS DIFERENTES, E NÃO SE EMPILHAM</w:t>
+            </w:r>
+          </w:p>
+          <w:p>
+            <w:pPr>
+              <w:spacing w:after="110" w:line="268"/>
+            </w:pPr>
+            <w:r>
+              <w:rPr>
+                <w:sz w:val="20"/>
+                <w:szCs w:val="20"/>
+              </w:rPr>
+              <w:t xml:space="preserve">Atordoado tira PARTE do turno: uma Ação Padrão e a reação. Você continua se defendendo.</w:t>
+            </w:r>
+          </w:p>
+          <w:p>
+            <w:pPr>
+              <w:spacing w:after="110" w:line="268"/>
+            </w:pPr>
+            <w:r>
+              <w:rPr>
+                <w:sz w:val="20"/>
+                <w:szCs w:val="20"/>
+              </w:rPr>
+              <w:t xml:space="preserve">Incapacitado não tira turno nenhum — tira a DEFESA. Você age e não se protege.</w:t>
+            </w:r>
+          </w:p>
+          <w:p>
+            <w:pPr>
+              <w:spacing w:after="110" w:line="268"/>
+            </w:pPr>
+            <w:r>
+              <w:rPr>
+                <w:sz w:val="20"/>
+                <w:szCs w:val="20"/>
+              </w:rPr>
+              <w:t xml:space="preserve">E eles não custam o mesmo: Atordoado é Pesada e Incapacitado é Leve. Tirar o que o alvo FAZ custa três vezes mais que tirar o que PROTEGE ele — e a conta concorda, porque em dano por rodada um vale pouco mais de três vezes o outro.</w:t>
+            </w:r>
+          </w:p>
+          <w:p>
+            <w:pPr>
+              <w:spacing w:after="20" w:line="268"/>
+            </w:pPr>
+            <w:r>
+              <w:rPr>
+                <w:sz w:val="20"/>
+                <w:szCs w:val="20"/>
+              </w:rPr>
+              <w:t xml:space="preserve">O Atordoado cobra uma Ação Padrão só de propósito: um chefe age mais de uma vez por rodada, e apagar o turno dele com uma linha de Controle sairia barato demais.</w:t>
+            </w:r>
+          </w:p>
+        </w:tc>
+      </w:tr>
+    </w:tbl>
+    <w:tbl>
+      <w:tblPr>
+        <w:tblW w:type="dxa" w:w="9000"/>
+        <w:tblBorders>
+          <w:top w:val="nil"/>
+          <w:left w:val="nil"/>
+          <w:bottom w:val="nil"/>
+          <w:right w:val="nil"/>
+          <w:insideH w:val="nil"/>
+          <w:insideV w:val="nil"/>
+        </w:tblBorders>
+      </w:tblPr>
+      <w:tblGrid>
+        <w:gridCol w:w="9000"/>
+      </w:tblGrid>
+      <w:tr>
+        <w:trPr>
+          <w:cantSplit/>
+        </w:trPr>
+        <w:tc>
+          <w:tcPr>
+            <w:tcW w:type="dxa" w:w="9000"/>
+            <w:tcBorders>
+              <w:top w:val="nil"/>
               <w:left w:val="single" w:color="741B47" w:sz="18"/>
               <w:bottom w:val="nil"/>
               <w:right w:val="nil"/>
@@ -26310,7 +26512,7 @@
                 <w:sz w:val="20"/>
                 <w:szCs w:val="20"/>
               </w:rPr>
-              <w:t xml:space="preserve">Exaustão é relógio de descanso, e Condição Menor não alcança ela.</w:t>
+              <w:t xml:space="preserve">Exaustão é relógio de descanso, e a Melhoria Condição não alcança ela.</w:t>
             </w:r>
           </w:p>
           <w:p>
@@ -29685,7 +29887,7 @@
                 <w:sz w:val="19"/>
                 <w:szCs w:val="19"/>
               </w:rPr>
-              <w:t xml:space="preserve">Remove uma Condição Menor de um aliado.</w:t>
+              <w:t xml:space="preserve">Remove de um aliado uma condição de nível Leve ou Média.</w:t>
             </w:r>
           </w:p>
         </w:tc>
@@ -29777,7 +29979,7 @@
                 <w:sz w:val="19"/>
                 <w:szCs w:val="19"/>
               </w:rPr>
-              <w:t xml:space="preserve">Remove uma Condição Maior de um aliado.</w:t>
+              <w:t xml:space="preserve">Remove de um aliado uma condição de qualquer nível.</w:t>
             </w:r>
           </w:p>
         </w:tc>
@@ -31160,7 +31362,7 @@
                 <w:sz w:val="19"/>
                 <w:szCs w:val="19"/>
               </w:rPr>
-              <w:t xml:space="preserve">Média</w:t>
+              <w:t xml:space="preserve">Leve ou Média</w:t>
             </w:r>
           </w:p>
         </w:tc>
@@ -31189,7 +31391,7 @@
                 <w:sz w:val="19"/>
                 <w:szCs w:val="19"/>
               </w:rPr>
-              <w:t xml:space="preserve">Você fica com uma Condição Menor até o fim do seu próximo turno.</w:t>
+              <w:t xml:space="preserve">Você fica com uma condição até o fim do seu próximo turno. Ela devolve o nível dela: uma condição Leve devolve Leve, uma Média devolve Média. Nível Pesada não entra, porque Restrição nunca devolve Pesada.</w:t>
             </w:r>
           </w:p>
         </w:tc>
@@ -41060,7 +41262,7 @@
                 <w:sz w:val="19"/>
                 <w:szCs w:val="19"/>
               </w:rPr>
-              <w:t xml:space="preserve">Cone (−1) · Derrubado (−2) · Lento (+2)</w:t>
+              <w:t xml:space="preserve">Cone (−1) · Derrubado (−1) · Lento (+2)</w:t>
             </w:r>
           </w:p>
         </w:tc>
@@ -41088,7 +41290,7 @@
                 <w:sz w:val="19"/>
                 <w:szCs w:val="19"/>
               </w:rPr>
-              <w:t xml:space="preserve">5d8 = 22 + Derrubado por uma rodada</w:t>
+              <w:t xml:space="preserve">6d8 = 27 + Derrubado por uma rodada</w:t>
             </w:r>
           </w:p>
         </w:tc>
@@ -41940,7 +42142,7 @@
                 <w:sz w:val="19"/>
                 <w:szCs w:val="19"/>
               </w:rPr>
-              <w:t xml:space="preserve">cura 5d8 = 22 e tira uma Condição Menor</w:t>
+              <w:t xml:space="preserve">cura 5d8 = 22 e tira uma condição de nível Leve ou Média</w:t>
             </w:r>
           </w:p>
         </w:tc>
@@ -43340,7 +43542,7 @@
                 <w:sz w:val="19"/>
                 <w:szCs w:val="19"/>
               </w:rPr>
-              <w:t xml:space="preserve">Explosão (−3) · Maior (−3) · Derrubado (−5) · Lento (+5)</w:t>
+              <w:t xml:space="preserve">Explosão (−3) · Maior (−3) · Derrubado (−3) · Lento (+5)</w:t>
             </w:r>
           </w:p>
         </w:tc>
@@ -43368,7 +43570,7 @@
                 <w:sz w:val="19"/>
                 <w:szCs w:val="19"/>
               </w:rPr>
-              <w:t xml:space="preserve">9d8 = 40 num raio de 4,5 m, todos Derrubados por uma rodada</w:t>
+              <w:t xml:space="preserve">11d8 = 49 num raio de 4,5 m, todos Derrubados por uma rodada</w:t>
             </w:r>
           </w:p>
         </w:tc>

</xml_diff>

<commit_message>
recorte da v0.107 — manual na v7.11, peça 11 e arquitetura.md atualizados
</commit_message>
<xml_diff>
--- a/manual/Fundamento-MANUAL-v7.docx
+++ b/manual/Fundamento-MANUAL-v7.docx
@@ -70,7 +70,7 @@
           <w:sz w:val="20"/>
           <w:szCs w:val="20"/>
         </w:rPr>
-        <w:t xml:space="preserve">Níveis 1–20  ·  Faixa lendária 21–30  ·  Versão 7.10</w:t>
+        <w:t xml:space="preserve">Níveis 1–20  ·  Faixa lendária 21–30  ·  Versão 7.11</w:t>
       </w:r>
     </w:p>
     <w:p>
@@ -39377,7 +39377,7 @@
                 <w:sz w:val="19"/>
                 <w:szCs w:val="19"/>
               </w:rPr>
-              <w:t xml:space="preserve">Liberação Máxima custa a rodada inteira, e você só tem as que o nível deu.</w:t>
+              <w:t xml:space="preserve">Liberação Máxima é Classe 3 ou mais, custa a rodada inteira, e você só tem as que o nível deu.</w:t>
             </w:r>
           </w:p>
         </w:tc>

</xml_diff>

<commit_message>
Recorte da v0.166 — manual v7.17
</commit_message>
<xml_diff>
--- a/manual/Fundamento-MANUAL-v7.docx
+++ b/manual/Fundamento-MANUAL-v7.docx
@@ -70,7 +70,7 @@
           <w:sz w:val="20"/>
           <w:szCs w:val="20"/>
         </w:rPr>
-        <w:t xml:space="preserve">Níveis 1–20  ·  Faixa lendária 21–30  ·  Versão 7.16</w:t>
+        <w:t xml:space="preserve">Níveis 1–20  ·  Faixa lendária 21–30  ·  Versão 7.17</w:t>
       </w:r>
     </w:p>
     <w:p>
@@ -6601,6 +6601,21 @@
     </w:p>
     <w:p>
       <w:pPr>
+        <w:spacing w:after="140" w:before="0" w:line="276"/>
+      </w:pPr>
+      <w:r>
+        <w:rPr>
+          <w:b/>
+          <w:bCs/>
+        </w:rPr>
+        <w:t xml:space="preserve">Classe 0 não cura.</w:t>
+      </w:r>
+      <w:r>
+        <w:t xml:space="preserve"> As Formas Cura e Onda ficam de fora dela. A tabela de cura da seção 2 começa na Classe 1, e é ela que diz o que uma cura vale — quem quer curar paga uma Classe.</w:t>
+      </w:r>
+    </w:p>
+    <w:p>
+      <w:pPr>
         <w:pStyle w:val="Heading2"/>
         <w:spacing w:after="160" w:before="340"/>
       </w:pPr>
@@ -19155,7 +19170,7 @@
                 <w:sz w:val="19"/>
                 <w:szCs w:val="19"/>
               </w:rPr>
-              <w:t xml:space="preserve">Cura, Apoio e Onda</w:t>
+              <w:t xml:space="preserve">Apoio</w:t>
             </w:r>
           </w:p>
         </w:tc>
@@ -19218,6 +19233,127 @@
         <w:tc>
           <w:tcPr>
             <w:tcW w:type="dxa" w:w="2430"/>
+            <w:tcMar>
+              <w:top w:type="dxa" w:w="60"/>
+              <w:left w:type="dxa" w:w="110"/>
+              <w:bottom w:type="dxa" w:w="60"/>
+              <w:right w:type="dxa" w:w="110"/>
+            </w:tcMar>
+            <w:vAlign w:val="center"/>
+          </w:tcPr>
+          <w:p>
+            <w:pPr>
+              <w:spacing w:after="40" w:before="40" w:line="240"/>
+              <w:jc w:val="center"/>
+            </w:pPr>
+            <w:r>
+              <w:rPr>
+                <w:b w:val="false"/>
+                <w:bCs w:val="false"/>
+                <w:color w:val="1A1A1A"/>
+                <w:sz w:val="19"/>
+                <w:szCs w:val="19"/>
+              </w:rPr>
+              <w:t xml:space="preserve">18 m</w:t>
+            </w:r>
+          </w:p>
+        </w:tc>
+      </w:tr>
+      <w:tr>
+        <w:trPr>
+          <w:cantSplit/>
+        </w:trPr>
+        <w:tc>
+          <w:tcPr>
+            <w:tcW w:type="dxa" w:w="2160"/>
+            <w:shd w:fill="F7F4F6" w:color="auto" w:val="clear"/>
+            <w:tcMar>
+              <w:top w:type="dxa" w:w="60"/>
+              <w:left w:type="dxa" w:w="110"/>
+              <w:bottom w:type="dxa" w:w="60"/>
+              <w:right w:type="dxa" w:w="110"/>
+            </w:tcMar>
+            <w:vAlign w:val="center"/>
+          </w:tcPr>
+          <w:p>
+            <w:pPr>
+              <w:spacing w:after="40" w:before="40" w:line="240"/>
+              <w:jc w:val="left"/>
+            </w:pPr>
+            <w:r>
+              <w:rPr>
+                <w:b/>
+                <w:bCs/>
+                <w:color w:val="1A1A1A"/>
+                <w:sz w:val="19"/>
+                <w:szCs w:val="19"/>
+              </w:rPr>
+              <w:t xml:space="preserve">Cura e Onda</w:t>
+            </w:r>
+          </w:p>
+        </w:tc>
+        <w:tc>
+          <w:tcPr>
+            <w:tcW w:type="dxa" w:w="1980"/>
+            <w:shd w:fill="F7F4F6" w:color="auto" w:val="clear"/>
+            <w:tcMar>
+              <w:top w:type="dxa" w:w="60"/>
+              <w:left w:type="dxa" w:w="110"/>
+              <w:bottom w:type="dxa" w:w="60"/>
+              <w:right w:type="dxa" w:w="110"/>
+            </w:tcMar>
+            <w:vAlign w:val="center"/>
+          </w:tcPr>
+          <w:p>
+            <w:pPr>
+              <w:spacing w:after="40" w:before="40" w:line="240"/>
+              <w:jc w:val="center"/>
+            </w:pPr>
+            <w:r>
+              <w:rPr>
+                <w:b w:val="false"/>
+                <w:bCs w:val="false"/>
+                <w:color w:val="1A1A1A"/>
+                <w:sz w:val="19"/>
+                <w:szCs w:val="19"/>
+              </w:rPr>
+              <w:t xml:space="preserve">—</w:t>
+            </w:r>
+          </w:p>
+        </w:tc>
+        <w:tc>
+          <w:tcPr>
+            <w:tcW w:type="dxa" w:w="2430"/>
+            <w:shd w:fill="F7F4F6" w:color="auto" w:val="clear"/>
+            <w:tcMar>
+              <w:top w:type="dxa" w:w="60"/>
+              <w:left w:type="dxa" w:w="110"/>
+              <w:bottom w:type="dxa" w:w="60"/>
+              <w:right w:type="dxa" w:w="110"/>
+            </w:tcMar>
+            <w:vAlign w:val="center"/>
+          </w:tcPr>
+          <w:p>
+            <w:pPr>
+              <w:spacing w:after="40" w:before="40" w:line="240"/>
+              <w:jc w:val="center"/>
+            </w:pPr>
+            <w:r>
+              <w:rPr>
+                <w:b w:val="false"/>
+                <w:bCs w:val="false"/>
+                <w:color w:val="1A1A1A"/>
+                <w:sz w:val="19"/>
+                <w:szCs w:val="19"/>
+              </w:rPr>
+              <w:t xml:space="preserve">9 m</w:t>
+            </w:r>
+          </w:p>
+        </w:tc>
+        <w:tc>
+          <w:tcPr>
+            <w:tcW w:type="dxa" w:w="2430"/>
+            <w:shd w:fill="F7F4F6" w:color="auto" w:val="clear"/>
             <w:tcMar>
               <w:top w:type="dxa" w:w="60"/>
               <w:left w:type="dxa" w:w="110"/>

</xml_diff>